<commit_message>
Rework the Dechra script around its SPECIFIC pet nutrition business
Co-Authored-By: Claude Opus 5.5 <noreply@anthropic.com>
Claude-Session: https://claude.ai/code/session_011Vvxd2V3zerAfjn84yXuuv
</commit_message>
<xml_diff>
--- a/call-scripts/Dechra-F1-Discovery-Call-Script.docx
+++ b/call-scripts/Dechra-F1-Discovery-Call-Script.docx
@@ -14,7 +14,7 @@
           <w:sz w:val="44"/>
           <w:szCs w:val="44"/>
         </w:rPr>
-        <w:t xml:space="preserve">Dechra x SPORTFIVE: F1 Discovery Call Script</w:t>
+        <w:t xml:space="preserve">Dechra (Pet Nutrition) x SPORTFIVE: F1 Discovery Call Script</w:t>
       </w:r>
     </w:p>
     <w:p>
@@ -29,7 +29,7 @@
         <w:t xml:space="preserve">Call type:</w:t>
       </w:r>
       <w:r>
-        <w:t xml:space="preserve"> First call / discovery, listening-led. Goal: open warm and short, say why Dechra caught our eye, make the goal plain (find out if it makes sense, not sell), let them talk, fill the brief with sharp questions, and test openly whether this sport can do a real job for a veterinary pharmaceuticals company. Agree next steps only if the conversation earns them.</w:t>
+        <w:t xml:space="preserve"> First call / discovery, listening-led, built around Dechra's pet nutrition business: SPECIFIC, its range of vet-recommended diets for cats and dogs. Goal: open warm and short, say why Dechra caught our eye, make the goal plain (find out if it makes sense, not sell), let them talk, fill the brief with sharp questions, and test openly whether this sport can do a real job for a pet food brand that sells through vets. Agree next steps only if the conversation earns them.</w:t>
       </w:r>
     </w:p>
     <w:p>
@@ -44,7 +44,7 @@
         <w:t xml:space="preserve">How to use this script:</w:t>
       </w:r>
       <w:r>
-        <w:t xml:space="preserve"> Every spoken block is written the way you'd say it out loud, contractions and all. Don't read it word for word; glance at the bold anchors and talk. This audience is scientific, commercial and, under private-equity owners, very numbers-minded. They'll be polite and skeptical, because Formula 1 isn't an obvious fit for animal medicine, and pretending otherwise would lose the room in a minute. Name the gap early, ask good questions, and let them talk more than you.</w:t>
+        <w:t xml:space="preserve"> Every spoken block is written the way you'd say it out loud, contractions and all. Don't read it word for word; glance at the bold anchors and talk. This audience is scientific, commercial and, under private-equity owners, very numbers-minded. They'll be polite and a little skeptical, because Formula 1 isn't an obvious home for pet food. Name the gap early, ask good questions, and let them talk more than you.</w:t>
       </w:r>
     </w:p>
     <w:p>
@@ -83,7 +83,7 @@
         <w:t xml:space="preserve">The goal of this call:</w:t>
       </w:r>
       <w:r>
-        <w:t xml:space="preserve"> understand Dechra, fill the brief, and find out together whether this sport fits a vet pharma company at all. The fit isn't obvious, so this call is a test, not a pitch. They should leave feeling understood, clear that "not yet" is a perfectly good answer, and clear that our advice costs them nothing.</w:t>
+        <w:t xml:space="preserve"> understand Dechra and its nutrition business, fill the brief, and find out together whether this sport fits a vet-recommended pet food brand at all. They should leave feeling understood, clear that "not yet" is a perfectly good answer, and clear that our advice costs them nothing.</w:t>
       </w:r>
     </w:p>
     <w:p>
@@ -164,7 +164,7 @@
           <w:b/>
           <w:bCs/>
         </w:rPr>
-        <w:t xml:space="preserve">How F1 works and where it could fit Dechra.</w:t>
+        <w:t xml:space="preserve">How F1 works and where it could fit Dechra's nutrition business.</w:t>
       </w:r>
       <w:r>
         <w:t xml:space="preserve"> 10 min</w:t>
@@ -235,27 +235,27 @@
         <w:t xml:space="preserve">We're here to find out, not to sell.</w:t>
       </w:r>
       <w:r>
-        <w:t xml:space="preserve"> There are no animals in Formula 1, and we say that out loud before they do. A plain "not yet" is a good outcome of this process. Hold that posture the whole way.</w:t>
-      </w:r>
-    </w:p>
-    <w:p>
-      <w:pPr>
-        <w:pStyle w:val="ListParagraph"/>
-        <w:numPr>
-          <w:ilvl w:val="0"/>
-          <w:numId w:val="1"/>
-        </w:numPr>
-        <w:spacing w:after="40" w:before="40"/>
-      </w:pPr>
-      <w:r>
-        <w:rPr>
-          <w:b/>
-          <w:bCs/>
-        </w:rPr>
-        <w:t xml:space="preserve">If there's a fit, it starts with the room.</w:t>
-      </w:r>
-      <w:r>
-        <w:t xml:space="preserve"> Dechra's business runs on a shrinking number of big relationships with vet groups and distributors, and a race weekend is one of the best places in business to spend three days with exactly those people. Pride for their own people in a year of change, and a story about precision and care, are the angles to test after that.</w:t>
+        <w:t xml:space="preserve"> There are no pets in Formula 1, and we say it before they do. A plain "not yet" is a good outcome. Hold that posture the whole way.</w:t>
+      </w:r>
+    </w:p>
+    <w:p>
+      <w:pPr>
+        <w:pStyle w:val="ListParagraph"/>
+        <w:numPr>
+          <w:ilvl w:val="0"/>
+          <w:numId w:val="1"/>
+        </w:numPr>
+        <w:spacing w:after="40" w:before="40"/>
+      </w:pPr>
+      <w:r>
+        <w:rPr>
+          <w:b/>
+          <w:bCs/>
+        </w:rPr>
+        <w:t xml:space="preserve">What goes in decides what comes out.</w:t>
+      </w:r>
+      <w:r>
+        <w:t xml:space="preserve"> Formula 1 obsesses over exactly what goes into the car and into the driver: in 2026 the cars run on 100% sustainable fuel, and teams have specialist nutrition partners for their drivers. SPECIFIC is built on the same belief for pets: precise nutrition for a specific need. That's the story to test.</w:t>
       </w:r>
     </w:p>
     <w:p>
@@ -275,7 +275,7 @@
         <w:t xml:space="preserve">Right-sized, built for an investor's test, and free.</w:t>
       </w:r>
       <w:r>
-        <w:t xml:space="preserve"> Whatever we bring back starts small, comes with a payback case their owners would accept, and costs them nothing to get: the rights holders pay our fee.</w:t>
+        <w:t xml:space="preserve"> Nutrition is a small part of Dechra (about 6% of revenue in their own filing), so whatever we bring back starts small, comes with a payback case their owners would accept, and costs them nothing to get: the rights holders pay our fee.</w:t>
       </w:r>
     </w:p>
     <w:p>
@@ -300,7 +300,20 @@
         <w:spacing w:after="40" w:before="40"/>
       </w:pPr>
       <w:r>
-        <w:t xml:space="preserve">[Name] of the Dechra contact, their role, pronunciation, and whether they sit in Boston, the UK or elsewhere</w:t>
+        <w:t xml:space="preserve">[Name] of the Dechra contact, their role, and whether they run nutrition (SPECIFIC) or sit in the wider company</w:t>
+      </w:r>
+    </w:p>
+    <w:p>
+      <w:pPr>
+        <w:pStyle w:val="ListParagraph"/>
+        <w:numPr>
+          <w:ilvl w:val="0"/>
+          <w:numId w:val="1"/>
+        </w:numPr>
+        <w:spacing w:after="40" w:before="40"/>
+      </w:pPr>
+      <w:r>
+        <w:t xml:space="preserve">Which markets SPECIFIC is sold in today (see Flags; the US is unconfirmed)</w:t>
       </w:r>
     </w:p>
     <w:p>
@@ -339,20 +352,7 @@
         <w:spacing w:after="40" w:before="40"/>
       </w:pPr>
       <w:r>
-        <w:t xml:space="preserve">Confirm internally: no live deal in animal health, pharma, pet care or pet nutrition</w:t>
-      </w:r>
-    </w:p>
-    <w:p>
-      <w:pPr>
-        <w:pStyle w:val="ListParagraph"/>
-        <w:numPr>
-          <w:ilvl w:val="0"/>
-          <w:numId w:val="1"/>
-        </w:numPr>
-        <w:spacing w:after="40" w:before="40"/>
-      </w:pPr>
-      <w:r>
-        <w:t xml:space="preserve">Have the advertising-rules line ready (see Flags) in case the pet-owner idea comes up</w:t>
+        <w:t xml:space="preserve">Confirm internally: no live deal in pet food, pet care or animal health</w:t>
       </w:r>
     </w:p>
     <w:p>
@@ -420,72 +420,134 @@
         <w:spacing w:after="40" w:before="40"/>
       </w:pPr>
       <w:r>
-        <w:t xml:space="preserve">Veterinary pharmaceuticals company. Founded in 1997 through a management buy-out from Lloyds Chemists, listed in London from 2000, and taken private by EQT in a deal that completed on 16 January 2024 (EQT X fund as majority owner, with Luxinva, part of the Abu Dhabi Investment Authority, as co-investor; offer valued around £4.5bn). UK roots in Northwich, Cheshire; in 2026 they moved their global headquarters to Boston's Seaport District (announced 11 March, opened 25 June 2026, per their releases) and proposed folding their UK offices into a new Manchester site.</w:t>
-      </w:r>
-    </w:p>
-    <w:p>
-      <w:pPr>
-        <w:pStyle w:val="ListParagraph"/>
-        <w:numPr>
-          <w:ilvl w:val="0"/>
-          <w:numId w:val="1"/>
-        </w:numPr>
-        <w:spacing w:after="40" w:before="40"/>
-      </w:pPr>
-      <w:r>
-        <w:t xml:space="preserve">Leadership: CEO Jesper Nordengaard since 10 June 2024, now based in Boston. Before Dechra he was President of North America at Colgate-Palmolive and, before that, ran Hill's Pet Nutrition: a consumer pet brand background. Laura Olsen is President, North America and Chief Marketing Officer. Kacey Carano runs Global Marketing and Technical Excellence. New in 2026: a Chief People &amp; Culture Officer (April) and Justine Conway as Chief Corporate Strategy &amp; Business Development Officer (August, ex-Elanco).</w:t>
-      </w:r>
-    </w:p>
-    <w:p>
-      <w:pPr>
-        <w:pStyle w:val="ListParagraph"/>
-        <w:numPr>
-          <w:ilvl w:val="0"/>
-          <w:numId w:val="1"/>
-        </w:numPr>
-        <w:spacing w:after="40" w:before="40"/>
-      </w:pPr>
-      <w:r>
-        <w:t xml:space="preserve">The numbers (year to 30 June 2025, from the Dechra Topco Limited accounts filed at Companies House in March 2026): revenue £830.6m; underlying EBITDA £155.5m; record R&amp;D spend of £76.4m, 9.2% of revenue; a reported operating loss of £225.4m after deal-related accounting charges; about £1.3bn of term loans drawn. 2,707 employees; their own sales teams in 27 countries and distributors in 60 more; seven manufacturing sites (UK, Netherlands, Croatia, US, Brazil, Australia). Revenue split: Europe 45.8%, North America 43.3%, International 10.9%.</w:t>
-      </w:r>
-    </w:p>
-    <w:p>
-      <w:pPr>
-        <w:pStyle w:val="ListParagraph"/>
-        <w:numPr>
-          <w:ilvl w:val="0"/>
-          <w:numId w:val="1"/>
-        </w:numPr>
-        <w:spacing w:after="40" w:before="40"/>
-      </w:pPr>
-      <w:r>
-        <w:t xml:space="preserve">What they sell, in plain words: mostly prescription medicines that vets prescribe. Companion animals are 73.9% of revenue (focus areas pain, dermatology, endocrinology and internal medicine; known brands include Vetoryl for Cushing's in dogs, Zycortal, Felimazole for cats, and the Specific pet diets), equine 9.9%, food-producing animals 9.3%, nutrition 6.3%. They bought Invetx (long-acting antibody medicines for dogs and cats) in September 2024 for $436.4m, and sold the Avishield poultry vaccine portfolio in June 2025 to focus, in their words, on "global leadership in specialty care, with a strong emphasis on companion animals and equine."</w:t>
-      </w:r>
-    </w:p>
-    <w:p>
-      <w:pPr>
-        <w:pStyle w:val="ListParagraph"/>
-        <w:numPr>
-          <w:ilvl w:val="0"/>
-          <w:numId w:val="1"/>
-        </w:numPr>
-        <w:spacing w:after="40" w:before="40"/>
-      </w:pPr>
-      <w:r>
-        <w:t xml:space="preserve">Customers and route to market: vets prescribe, wholesalers mostly deliver. Their own filing names the growth of corporate vet groups and buying groups as a principal market risk, managed by key account managers. Many of their field reps are qualified vets, and the Dechra Academy runs free CPD for vets (28,639 CPD hours in FY2025, per the filing).</w:t>
-      </w:r>
-    </w:p>
-    <w:p>
-      <w:pPr>
-        <w:pStyle w:val="ListParagraph"/>
-        <w:numPr>
-          <w:ilvl w:val="0"/>
-          <w:numId w:val="1"/>
-        </w:numPr>
-        <w:spacing w:after="40" w:before="40"/>
-      </w:pPr>
-      <w:r>
-        <w:t xml:space="preserve">Strategy, people and causes: the Dechra 2030 strategy launched in December 2024 with a Transformation Office. Employee engagement index 84% in their September 2024 survey (91% took part); employee turnover 19.4% in FY2025, a transformation year. Their investors are advised by an Advisory Committee (independent and nominated members) that the CEO and CFO attend every two months, and it reviews and approves deals. Causes: partner of Not One More Vet (vet mental wellbeing; staff joined its Race Around the World fundraiser), a Human-Animal Bond Certified Company since November 2025, and Boston community gifts for therapy animals and a police comfort dog program (June 2026). Sport history: US equestrian sponsorships around 2024 (World Equestrian Center, Kentucky Horse Park, reining shows); verify what is still live.</w:t>
+        <w:rPr>
+          <w:b/>
+          <w:bCs/>
+        </w:rPr>
+        <w:t xml:space="preserve">The company:</w:t>
+      </w:r>
+      <w:r>
+        <w:t xml:space="preserve"> a veterinary medicines and nutrition company. Founded in 1997 through a management buy-out from Lloyds Chemists, listed in London from 2000, and taken private by EQT in a deal that completed on 16 January 2024 (EQT X fund as majority owner, with Luxinva, part of the Abu Dhabi Investment Authority, as co-investor; offer valued around £4.5bn). UK roots in Northwich, Cheshire; in 2026 they moved their global headquarters to Boston's Seaport District (announced March, opened June 2026, per their releases).</w:t>
+      </w:r>
+    </w:p>
+    <w:p>
+      <w:pPr>
+        <w:pStyle w:val="ListParagraph"/>
+        <w:numPr>
+          <w:ilvl w:val="0"/>
+          <w:numId w:val="1"/>
+        </w:numPr>
+        <w:spacing w:after="40" w:before="40"/>
+      </w:pPr>
+      <w:r>
+        <w:rPr>
+          <w:b/>
+          <w:bCs/>
+        </w:rPr>
+        <w:t xml:space="preserve">The pet food business, SPECIFIC:</w:t>
+      </w:r>
+      <w:r>
+        <w:t xml:space="preserve"> Dechra's cat and dog nutrition brand. It covers special-care diets that support specific health conditions (gut, kidney and heart, skin, weight and more) and life-stage diets for healthy pets, wet and dry. Built on fish as a key protein and omega-3 source, per their own materials. Dechra says SPECIFIC is not sold in retail and that they don't actively work with pet e-commerce sites: it's sold through vets. Trade press describes decades of vet-only distribution across Europe. New in 2026: updated kidney and heart support diets, including a new hydrolysed version (reported in April and June 2026; the dates conflict, so say "this year").</w:t>
+      </w:r>
+    </w:p>
+    <w:p>
+      <w:pPr>
+        <w:pStyle w:val="ListParagraph"/>
+        <w:numPr>
+          <w:ilvl w:val="0"/>
+          <w:numId w:val="1"/>
+        </w:numPr>
+        <w:spacing w:after="40" w:before="40"/>
+      </w:pPr>
+      <w:r>
+        <w:rPr>
+          <w:b/>
+          <w:bCs/>
+        </w:rPr>
+        <w:t xml:space="preserve">How big nutrition is:</w:t>
+      </w:r>
+      <w:r>
+        <w:t xml:space="preserve"> in the year to 30 June 2025 (Dechra Topco Limited accounts at Companies House), nutrition was 6.3% of group revenue of £830.6m. So SPECIFIC is a small brand inside a much bigger medicines company. Treat any budget as likely to need corporate sign-off.</w:t>
+      </w:r>
+    </w:p>
+    <w:p>
+      <w:pPr>
+        <w:pStyle w:val="ListParagraph"/>
+        <w:numPr>
+          <w:ilvl w:val="0"/>
+          <w:numId w:val="1"/>
+        </w:numPr>
+        <w:spacing w:after="40" w:before="40"/>
+      </w:pPr>
+      <w:r>
+        <w:rPr>
+          <w:b/>
+          <w:bCs/>
+        </w:rPr>
+        <w:t xml:space="preserve">The wider company, for context:</w:t>
+      </w:r>
+      <w:r>
+        <w:t xml:space="preserve"> companion animals are 73.9% of revenue, mostly prescription medicines for pets (Vetoryl, Zycortal, Felimazole); equine 9.9%; food-producing animals 9.3%. 2,707 employees; own sales teams in 27 countries. Revenue split: Europe 45.8%, North America 43.3%, International 10.9%. Bought Invetx for $436.4m in 2024. Underlying EBITDA £155.5m; about £1.3bn of term loans drawn.</w:t>
+      </w:r>
+    </w:p>
+    <w:p>
+      <w:pPr>
+        <w:pStyle w:val="ListParagraph"/>
+        <w:numPr>
+          <w:ilvl w:val="0"/>
+          <w:numId w:val="1"/>
+        </w:numPr>
+        <w:spacing w:after="40" w:before="40"/>
+      </w:pPr>
+      <w:r>
+        <w:rPr>
+          <w:b/>
+          <w:bCs/>
+        </w:rPr>
+        <w:t xml:space="preserve">Leadership:</w:t>
+      </w:r>
+      <w:r>
+        <w:t xml:space="preserve"> CEO Jesper Nordengaard since June 2024, now based in Boston. Before Dechra he was President of North America at Colgate-Palmolive and, before that, ran Hill's Pet Nutrition, one of the biggest names in vet-recommended pet food. That background makes nutrition a natural conversation for him. Laura Olsen is President, North America and Chief Marketing Officer.</w:t>
+      </w:r>
+    </w:p>
+    <w:p>
+      <w:pPr>
+        <w:pStyle w:val="ListParagraph"/>
+        <w:numPr>
+          <w:ilvl w:val="0"/>
+          <w:numId w:val="1"/>
+        </w:numPr>
+        <w:spacing w:after="40" w:before="40"/>
+      </w:pPr>
+      <w:r>
+        <w:rPr>
+          <w:b/>
+          <w:bCs/>
+        </w:rPr>
+        <w:t xml:space="preserve">Customers and route to market:</w:t>
+      </w:r>
+      <w:r>
+        <w:t xml:space="preserve"> vets recommend and sell SPECIFIC; vet nurses often lead the nutrition conversation in clinics. Dechra's filing names the growth of corporate vet groups and buying groups as a principal market risk, managed by key account managers. The Dechra Academy runs free education for vets.</w:t>
+      </w:r>
+    </w:p>
+    <w:p>
+      <w:pPr>
+        <w:pStyle w:val="ListParagraph"/>
+        <w:numPr>
+          <w:ilvl w:val="0"/>
+          <w:numId w:val="1"/>
+        </w:numPr>
+        <w:spacing w:after="40" w:before="40"/>
+      </w:pPr>
+      <w:r>
+        <w:rPr>
+          <w:b/>
+          <w:bCs/>
+        </w:rPr>
+        <w:t xml:space="preserve">Causes:</w:t>
+      </w:r>
+      <w:r>
+        <w:t xml:space="preserve"> partner of Not One More Vet (vet mental wellbeing), a Human-Animal Bond Certified Company since November 2025, and Boston community gifts for therapy animals in June 2026. Sport history: US equestrian sponsorships around 2024; verify what is still live.</w:t>
       </w:r>
     </w:p>
     <w:p>
@@ -518,10 +580,70 @@
           <w:b/>
           <w:bCs/>
         </w:rPr>
-        <w:t xml:space="preserve">Capacity note, normal on size, high scrutiny:</w:t>
-      </w:r>
-      <w:r>
-        <w:t xml:space="preserve"> £830m revenue and 2,700 people put entry-level team positions within reach on size alone. But this is a private-equity-owned, leveraged business in the middle of a transformation, with a reported operating loss in FY2025 from deal accounting. Every investment needs a payback case the owners would accept. Surface budget and the decision process in the first half, lead with hospitality and content, size with honest numbers, and no headline-deal talk.</w:t>
+        <w:t xml:space="preserve">Capacity caution, FIRM for a nutrition-only budget:</w:t>
+      </w:r>
+      <w:r>
+        <w:t xml:space="preserve"> nutrition is about 6% of Dechra's revenue, so a SPECIFIC-funded program is likely small: content, hospitality and a driver or ambassador program, not a team seat. If corporate Dechra funds it (£830m revenue, PE-owned, leveraged, in a transformation), entry-level positions are within reach on size but every pound needs a payback case. Surface budget, and who owns it, in the first half.</w:t>
+      </w:r>
+    </w:p>
+    <w:p>
+      <w:pPr>
+        <w:pStyle w:val="ListParagraph"/>
+        <w:numPr>
+          <w:ilvl w:val="0"/>
+          <w:numId w:val="1"/>
+        </w:numPr>
+        <w:spacing w:after="40" w:before="40"/>
+      </w:pPr>
+      <w:r>
+        <w:rPr>
+          <w:b/>
+          <w:bCs/>
+        </w:rPr>
+        <w:t xml:space="preserve">Which markets:</w:t>
+      </w:r>
+      <w:r>
+        <w:t xml:space="preserve"> SPECIFIC's European vet channel is well documented. The only North American arrangement we found is an older one with a Kansas City distributor, so US availability is unconfirmed. Ask on the call. Until confirmed, build any pet-owner idea Europe-first.</w:t>
+      </w:r>
+    </w:p>
+    <w:p>
+      <w:pPr>
+        <w:pStyle w:val="ListParagraph"/>
+        <w:numPr>
+          <w:ilvl w:val="0"/>
+          <w:numId w:val="1"/>
+        </w:numPr>
+        <w:spacing w:after="40" w:before="40"/>
+      </w:pPr>
+      <w:r>
+        <w:rPr>
+          <w:b/>
+          <w:bCs/>
+        </w:rPr>
+        <w:t xml:space="preserve">Advertising and claims rules:</w:t>
+      </w:r>
+      <w:r>
+        <w:t xml:space="preserve"> pet food is not a prescription medicine, so the ban on advertising prescription vet medicines to the public does not stop owner-facing SPECIFIC content. But diets that support medical conditions carry their own claim rules (in the EU, rules for feeds with particular nutritional purposes; in the US, FDA scrutiny of therapeutic diet claims). Keep any owner-facing idea about care, nutrition and "ask your vet", never condition claims, and verify with their regulatory team before anything goes on paper. Their medicines stay out of owner-facing ideas outside the US.</w:t>
+      </w:r>
+    </w:p>
+    <w:p>
+      <w:pPr>
+        <w:pStyle w:val="ListParagraph"/>
+        <w:numPr>
+          <w:ilvl w:val="0"/>
+          <w:numId w:val="1"/>
+        </w:numPr>
+        <w:spacing w:after="40" w:before="40"/>
+      </w:pPr>
+      <w:r>
+        <w:rPr>
+          <w:b/>
+          <w:bCs/>
+        </w:rPr>
+        <w:t xml:space="preserve">Channel rule:</w:t>
+      </w:r>
+      <w:r>
+        <w:t xml:space="preserve"> Dechra keeps SPECIFIC out of retail and e-commerce. Any consumer idea must send owners to their vet, not to a shop. Don't propose anything that breaks their channel.</w:t>
       </w:r>
     </w:p>
     <w:p>
@@ -541,47 +663,7 @@
         <w:t xml:space="preserve">Fit check, be open about it:</w:t>
       </w:r>
       <w:r>
-        <w:t xml:space="preserve"> the F1 fit is not obvious. No animals in the sport and no vet story to borrow. Go in to test four angles in this order of strength: the room (vet group owners and distributors), pride for their own people under new ownership, a care-and-precision story, and a pet-owner consumer story. The room is strongest; the consumer story is weakest and the most regulated. Be ready to recommend "not yet."</w:t>
-      </w:r>
-    </w:p>
-    <w:p>
-      <w:pPr>
-        <w:pStyle w:val="ListParagraph"/>
-        <w:numPr>
-          <w:ilvl w:val="0"/>
-          <w:numId w:val="1"/>
-        </w:numPr>
-        <w:spacing w:after="40" w:before="40"/>
-      </w:pPr>
-      <w:r>
-        <w:rPr>
-          <w:b/>
-          <w:bCs/>
-        </w:rPr>
-        <w:t xml:space="preserve">Advertising rules:</w:t>
-      </w:r>
-      <w:r>
-        <w:t xml:space="preserve"> most of their products are prescription-only. Under EU Regulation 2019/6 (Article 120), prescription vet medicines can be advertised only to vets and people allowed to supply them, not the public; our understanding is the UK works the same way, while the US allows owner-facing pet medicine ads under FDA rules. So outside the US, any pet-owner idea must be corporate-brand or cause-led, never product-led. Their pet diets (Specific) are not medicines. Verify market by market with their regulatory team before anything goes on paper.</w:t>
-      </w:r>
-    </w:p>
-    <w:p>
-      <w:pPr>
-        <w:pStyle w:val="ListParagraph"/>
-        <w:numPr>
-          <w:ilvl w:val="0"/>
-          <w:numId w:val="1"/>
-        </w:numPr>
-        <w:spacing w:after="40" w:before="40"/>
-      </w:pPr>
-      <w:r>
-        <w:rPr>
-          <w:b/>
-          <w:bCs/>
-        </w:rPr>
-        <w:t xml:space="preserve">HQ ambiguity:</w:t>
-      </w:r>
-      <w:r>
-        <w:t xml:space="preserve"> our brief called them UK-headquartered. Since June 2026 their global headquarters is in Boston; the registered UK company is still in Northwich per the FY2025 filing. On the call, say "UK roots, new home in Boston" and let them describe it.</w:t>
+        <w:t xml:space="preserve"> the F1 fit is not obvious. Test four angles in this order of strength: the room (vet group owners, distributors, nutrition-led clinics), the "what goes in" nutrition story, pet owners in Europe, and pride for their own people. Be ready to recommend "not yet."</w:t>
       </w:r>
     </w:p>
     <w:p>
@@ -601,7 +683,7 @@
         <w:t xml:space="preserve">No standing compliance or defense flags triggered:</w:t>
       </w:r>
       <w:r>
-        <w:t xml:space="preserve"> roots are UK, headquarters now US, owners are EQT (Sweden) and ADIA's Luxinva. Brazil is an operating subsidiary, not roots. Name both owners correctly if ownership comes up.</w:t>
+        <w:t xml:space="preserve"> roots are UK, headquarters now US, owners are EQT (Sweden) and ADIA's Luxinva.</w:t>
       </w:r>
     </w:p>
     <w:p>
@@ -621,7 +703,7 @@
         <w:t xml:space="preserve">Category check:</w:t>
       </w:r>
       <w:r>
-        <w:t xml:space="preserve"> claim nothing open. Animal health, pharma, pet care and pet nutrition get mapped team by team, and the series too, at the recommendations stage. Also check whether any team or the series restricts pharma-linked partners.</w:t>
+        <w:t xml:space="preserve"> claim nothing open. Pet food, pet care and animal health get mapped team by team, and the series too, at the recommendations stage.</w:t>
       </w:r>
     </w:p>
     <w:p>
@@ -641,7 +723,7 @@
         <w:t xml:space="preserve">Claims discipline:</w:t>
       </w:r>
       <w:r>
-        <w:t xml:space="preserve"> never say or imply any F1 team uses Dechra products or has any link to animal health. Their numbers come from the Companies House filing and their own releases; attribute them ("your filing says", "as you announced"). We have no data on pet ownership among F1 fans; don't guess. The ideas in 4.4 and 4.5 are ideas to build, not facts. If you want the well-known story of a children's hospital learning patient handovers from a pit crew, verify it first; it is not in our checked facts.</w:t>
+        <w:t xml:space="preserve"> never say or imply any F1 team, driver or the series uses or recommends SPECIFIC, or has any link to pet nutrition. Don't name drivers' pets or pet stories unless verified. Dechra's numbers come from the Companies House filing and their releases; attribute them. We have no data on pet ownership among F1 fans; don't guess. The ideas in 4.4 and 4.5 are ideas to build, not facts.</w:t>
       </w:r>
     </w:p>
     <w:p>
@@ -661,7 +743,7 @@
         <w:t xml:space="preserve">Names check:</w:t>
       </w:r>
       <w:r>
-        <w:t xml:space="preserve"> citations in this script (Technogym as McLaren's fitness partner since 2004, Cognizant, ServiceNow, NetApp and Tata Communications as B2B names around the sport, RUCKUS at Haas, Airwallex at McLaren, Liberty Media's ownership since 2017) were verified in September 2026 checks; Dechra facts were checked on 20 October 2026 against their filing and newsroom. Re-verify on call day.</w:t>
+        <w:t xml:space="preserve"> citations in this script (Optimum Nutrition as McLaren's sports nutrition partner in 2026, Technogym as McLaren's fitness partner since 2004, Cognizant, ServiceNow, NetApp and Tata Communications as B2B names around the sport, RUCKUS at Haas, Airwallex at McLaren, Liberty Media's ownership since 2017) were verified in September 2026 checks; Dechra and SPECIFIC facts were checked on 20 October 2026 against their filing, newsroom and UK nutrition pages. Re-verify on call day.</w:t>
       </w:r>
     </w:p>
     <w:p>
@@ -681,7 +763,7 @@
         <w:t xml:space="preserve">Pipeline check:</w:t>
       </w:r>
       <w:r>
-        <w:t xml:space="preserve"> confirm no live deal in animal health, pharma, pet care or pet nutrition, and check the register for earlier Dechra outreach.</w:t>
+        <w:t xml:space="preserve"> confirm no live deal in pet food, pet care or animal health, and check the register for earlier Dechra outreach.</w:t>
       </w:r>
     </w:p>
     <w:p>
@@ -723,6 +805,19 @@
         <w:spacing w:after="40" w:before="40"/>
       </w:pPr>
       <w:r>
+        <w:t xml:space="preserve">Fan habits (index, 100 = general population): brand loyalists 200, buy premium 132, research online before buying 126. All number one in sport. This is the pet food number: premium food is a loyal, well-researched purchase. No pet ownership data exists in our bank.</w:t>
+      </w:r>
+    </w:p>
+    <w:p>
+      <w:pPr>
+        <w:pStyle w:val="ListParagraph"/>
+        <w:numPr>
+          <w:ilvl w:val="0"/>
+          <w:numId w:val="1"/>
+        </w:numPr>
+        <w:spacing w:after="40" w:before="40"/>
+      </w:pPr>
+      <w:r>
         <w:t xml:space="preserve">1.83bn total TV audience in 2025. 76M average per Grand Prix. Around 24 race weekends across five continents.</w:t>
       </w:r>
     </w:p>
@@ -749,33 +844,33 @@
         <w:spacing w:after="40" w:before="40"/>
       </w:pPr>
       <w:r>
-        <w:t xml:space="preserve">Hospitality maths: passes work all three days. Seven passes can host twenty different guests in one weekend. This is the number for Dechra.</w:t>
-      </w:r>
-    </w:p>
-    <w:p>
-      <w:pPr>
-        <w:pStyle w:val="ListParagraph"/>
-        <w:numPr>
-          <w:ilvl w:val="0"/>
-          <w:numId w:val="1"/>
-        </w:numPr>
-        <w:spacing w:after="40" w:before="40"/>
-      </w:pPr>
-      <w:r>
-        <w:t xml:space="preserve">Fan habits (index, 100 = general population): brand loyalists 200, buy premium 132, research online before buying 126. All number one in sport. Useful for the pet-owner angle; no pet ownership data exists in our bank.</w:t>
-      </w:r>
-    </w:p>
-    <w:p>
-      <w:pPr>
-        <w:pStyle w:val="ListParagraph"/>
-        <w:numPr>
-          <w:ilvl w:val="0"/>
-          <w:numId w:val="1"/>
-        </w:numPr>
-        <w:spacing w:after="40" w:before="40"/>
-      </w:pPr>
-      <w:r>
-        <w:t xml:space="preserve">US: three US races, two American teams in Haas and Cadillac, Apple broadcasts the sport, US purchase consideration up 32% (women 41%, Gen Z 39%). Relevant now their headquarters is in Boston.</w:t>
+        <w:t xml:space="preserve">Hospitality maths: passes work all three days. Seven passes can host twenty different guests in one weekend.</w:t>
+      </w:r>
+    </w:p>
+    <w:p>
+      <w:pPr>
+        <w:pStyle w:val="ListParagraph"/>
+        <w:numPr>
+          <w:ilvl w:val="0"/>
+          <w:numId w:val="1"/>
+        </w:numPr>
+        <w:spacing w:after="40" w:before="40"/>
+      </w:pPr>
+      <w:r>
+        <w:t xml:space="preserve">Social: F1 is number one in sport for engagement, 2.2bn engagements, ahead of the NBA. 61% of fans engage with content daily.</w:t>
+      </w:r>
+    </w:p>
+    <w:p>
+      <w:pPr>
+        <w:pStyle w:val="ListParagraph"/>
+        <w:numPr>
+          <w:ilvl w:val="0"/>
+          <w:numId w:val="1"/>
+        </w:numPr>
+        <w:spacing w:after="40" w:before="40"/>
+      </w:pPr>
+      <w:r>
+        <w:t xml:space="preserve">US: three US races, two American teams in Haas and Cadillac, Apple broadcasts the sport, US purchase consideration up 32% (women 41%, Gen Z 39%).</w:t>
       </w:r>
     </w:p>
     <w:p>
@@ -801,20 +896,7 @@
         <w:spacing w:after="40" w:before="40"/>
       </w:pPr>
       <w:r>
-        <w:t xml:space="preserve">Social: F1 is number one in sport for engagement, 2.2bn engagements, ahead of the NBA. 61% of fans engage with content daily.</w:t>
-      </w:r>
-    </w:p>
-    <w:p>
-      <w:pPr>
-        <w:pStyle w:val="ListParagraph"/>
-        <w:numPr>
-          <w:ilvl w:val="0"/>
-          <w:numId w:val="1"/>
-        </w:numPr>
-        <w:spacing w:after="40" w:before="40"/>
-      </w:pPr>
-      <w:r>
-        <w:t xml:space="preserve">Rules and sustainability: cost cap since 2021; 2026 cars run on 100% sustainable fuel; Net Zero 2030 commitment. Dechra has science-based climate targets, so this can come up.</w:t>
+        <w:t xml:space="preserve">Rules and sustainability: cost cap since 2021; 2026 cars run on 100% sustainable fuel; Net Zero 2030 commitment.</w:t>
       </w:r>
     </w:p>
     <w:p>
@@ -894,22 +976,22 @@
         <w:rPr>
           <w:color w:val="1F3864"/>
         </w:rPr>
-        <w:t xml:space="preserve">The reason for the call is simple. We've been following Dechra's last couple of years: new owners, a new plan, a new home in Boston, and a real push into specialty care for pets. From our desk research, a Formula 1 conversation felt worth having, even if the link isn't obvious at first.</w:t>
-      </w:r>
-    </w:p>
-    <w:p>
-      <w:pPr>
-        <w:pBdr>
-          <w:left w:val="single" w:color="2E74B5" w:sz="18" w:space="12"/>
-        </w:pBdr>
-        <w:spacing w:after="60" w:before="60"/>
-        <w:ind w:left="420"/>
-      </w:pPr>
-      <w:r>
-        <w:rPr>
-          <w:color w:val="1F3864"/>
-        </w:rPr>
-        <w:t xml:space="preserve">And I want to be clear on the goal today: it's not for me to tell you why F1 is a good fit. It's to figure out, together, whether it makes sense at all for a company that makes medicines for animals. We learn about you, you ask us anything, and we see where Dechra could fit, if anywhere.</w:t>
+        <w:t xml:space="preserve">The reason for the call is simple. We've been following Dechra: new owners, a new home in Boston, and your SPECIFIC nutrition range, which keeps moving, with new kidney and heart diets this year. From our desk research, a Formula 1 conversation felt worth having, even if the link isn't obvious at first.</w:t>
+      </w:r>
+    </w:p>
+    <w:p>
+      <w:pPr>
+        <w:pBdr>
+          <w:left w:val="single" w:color="2E74B5" w:sz="18" w:space="12"/>
+        </w:pBdr>
+        <w:spacing w:after="60" w:before="60"/>
+        <w:ind w:left="420"/>
+      </w:pPr>
+      <w:r>
+        <w:rPr>
+          <w:color w:val="1F3864"/>
+        </w:rPr>
+        <w:t xml:space="preserve">And I want to be clear on the goal today: it's not for me to tell you why F1 is a good fit. It's to figure out, together, whether it makes sense at all for a pet food brand that sells through vets. We learn about you, you ask us anything, and we see where Dechra could fit, if anywhere.</w:t>
       </w:r>
     </w:p>
     <w:p>
@@ -952,7 +1034,7 @@
         <w:rPr>
           <w:color w:val="1F3864"/>
         </w:rPr>
-        <w:t xml:space="preserve">"Great. [Name], over to you. Where's Dechra right now, and where's it headed? We'll take it from there."</w:t>
+        <w:t xml:space="preserve">"Great. [Name], over to you. Where's SPECIFIC right now, and where's it headed? We'll take it from there."</w:t>
       </w:r>
     </w:p>
     <w:p>
@@ -1031,37 +1113,37 @@
         <w:rPr>
           <w:color w:val="1F3864"/>
         </w:rPr>
-        <w:t xml:space="preserve">The company itself: a 1997 buy-out that grew into one of the real specialists in animal health. Over eight hundred million pounds in sales, about twenty-seven hundred people, and in the last two years new owners, a new strategy and a new global home in Boston. That's a company in motion, and we notice those.</w:t>
-      </w:r>
-    </w:p>
-    <w:p>
-      <w:pPr>
-        <w:pBdr>
-          <w:left w:val="single" w:color="2E74B5" w:sz="18" w:space="12"/>
-        </w:pBdr>
-        <w:spacing w:after="60" w:before="60"/>
-        <w:ind w:left="420"/>
-      </w:pPr>
-      <w:r>
-        <w:rPr>
-          <w:color w:val="1F3864"/>
-        </w:rPr>
-        <w:t xml:space="preserve">Then the way you sell. Your business runs on relationships: vets, the big vet groups, the distributors. And your own filing says those buyers are getting fewer and bigger. This sport happens to be one of the best places in business to spend real time with a small number of important people.</w:t>
-      </w:r>
-    </w:p>
-    <w:p>
-      <w:pPr>
-        <w:pBdr>
-          <w:left w:val="single" w:color="2E74B5" w:sz="18" w:space="12"/>
-        </w:pBdr>
-        <w:spacing w:after="60" w:before="60"/>
-        <w:ind w:left="420"/>
-      </w:pPr>
-      <w:r>
-        <w:rPr>
-          <w:color w:val="1F3864"/>
-        </w:rPr>
-        <w:t xml:space="preserve">And the straight part: there are no animals in Formula 1, and I won't pretend the link is obvious. That's exactly why we wanted to ask, not pitch."</w:t>
+        <w:t xml:space="preserve">The company: new owners, a new strategy, a new global home in Boston, and a CEO who ran one of the biggest names in pet nutrition before he joined you. That tells me nutrition matters here.</w:t>
+      </w:r>
+    </w:p>
+    <w:p>
+      <w:pPr>
+        <w:pBdr>
+          <w:left w:val="single" w:color="2E74B5" w:sz="18" w:space="12"/>
+        </w:pBdr>
+        <w:spacing w:after="60" w:before="60"/>
+        <w:ind w:left="420"/>
+      </w:pPr>
+      <w:r>
+        <w:rPr>
+          <w:color w:val="1F3864"/>
+        </w:rPr>
+        <w:t xml:space="preserve">Then the idea behind SPECIFIC. Precise nutrition for a specific need, recommended by the vet who knows the animal. And it so happens there's a sport that obsesses over exactly that: what goes into the car, what goes into the driver, measured and planned down to the detail. In 2026 the cars even run on fully sustainable fuel. What goes in decides what comes out. That's your idea too.</w:t>
+      </w:r>
+    </w:p>
+    <w:p>
+      <w:pPr>
+        <w:pBdr>
+          <w:left w:val="single" w:color="2E74B5" w:sz="18" w:space="12"/>
+        </w:pBdr>
+        <w:spacing w:after="60" w:before="60"/>
+        <w:ind w:left="420"/>
+      </w:pPr>
+      <w:r>
+        <w:rPr>
+          <w:color w:val="1F3864"/>
+        </w:rPr>
+        <w:t xml:space="preserve">And the straight part: there are no pets in Formula 1, and I won't pretend the link is obvious. That's exactly why we wanted to ask, not pitch."</w:t>
       </w:r>
     </w:p>
     <w:p>
@@ -1103,22 +1185,22 @@
         <w:rPr>
           <w:color w:val="1F3864"/>
         </w:rPr>
-        <w:t xml:space="preserve">The instinct: nothing about Dechra says big logo on a car. If there's a fit, it's smaller and sharper. Hosting the people who decide your year at a race. Something your own people could be proud of after a lot of change. And maybe, in the US, a story for pet owners about care and precision. Each of those has to earn its place with numbers your owners would sign off.</w:t>
-      </w:r>
-    </w:p>
-    <w:p>
-      <w:pPr>
-        <w:pBdr>
-          <w:left w:val="single" w:color="2E74B5" w:sz="18" w:space="12"/>
-        </w:pBdr>
-        <w:spacing w:after="60" w:before="60"/>
-        <w:ind w:left="420"/>
-      </w:pPr>
-      <w:r>
-        <w:rPr>
-          <w:color w:val="1F3864"/>
-        </w:rPr>
-        <w:t xml:space="preserve">But that's instinct after desk research. Tell me about Dechra, and by the end of the call I'll have a much better answer. And if the real answer is 'not yet', I'll say that too."</w:t>
+        <w:t xml:space="preserve">The instinct: nothing about SPECIFIC says big logo on a car. If there's a fit, it's smaller and sharper. Hosting the vet groups and clinics who recommend your diets. A 'what goes in' nutrition story for vets and vet nurses. And maybe, in Europe, something for pet owners that sends them to their vet. Each of those has to earn its place with numbers your owners would sign off.</w:t>
+      </w:r>
+    </w:p>
+    <w:p>
+      <w:pPr>
+        <w:pBdr>
+          <w:left w:val="single" w:color="2E74B5" w:sz="18" w:space="12"/>
+        </w:pBdr>
+        <w:spacing w:after="60" w:before="60"/>
+        <w:ind w:left="420"/>
+      </w:pPr>
+      <w:r>
+        <w:rPr>
+          <w:color w:val="1F3864"/>
+        </w:rPr>
+        <w:t xml:space="preserve">But that's instinct after desk research. Tell me about SPECIFIC, and by the end of the call I'll have a much better answer. And if the real answer is 'not yet', I'll say that too."</w:t>
       </w:r>
     </w:p>
     <w:p>
@@ -1161,7 +1243,7 @@
         <w:rPr>
           <w:color w:val="1F3864"/>
         </w:rPr>
-        <w:t xml:space="preserve">Dechra makes medicines for animals and sells them through vets. Mostly for dogs and cats, plus horses and some farm animals. Most of the business is specialty care for pets: hormone conditions, skin, pain. Europe and North America are about the same size for you, with your own teams in twenty-seven countries. EQT took you private at the start of 2024, you bought Invetx for the antibody pipeline, you launched a 2030 plan, and this summer you opened a new global headquarters in Boston.</w:t>
+        <w:t xml:space="preserve">Dechra is best known for medicines for animals, but SPECIFIC is your pet food: diets for cats and dogs, some for healthy pets at each life stage, and many that support a specific condition, like the gut or the kidneys. It's sold through vets, not in shops, and it's been in European clinics for a long time. From your filing, nutrition is a smaller part of the group, around six percent, inside a company that's been through a lot of change: EQT, a 2030 plan, and Boston this summer.</w:t>
       </w:r>
     </w:p>
     <w:p>
@@ -1279,20 +1361,20 @@
         <w:spacing w:after="40" w:before="40"/>
       </w:pPr>
       <w:r>
-        <w:t xml:space="preserve">"Tell me where Dechra is right now, in your own words. What's going well, and what's the next hill to climb?"</w:t>
-      </w:r>
-    </w:p>
-    <w:p>
-      <w:pPr>
-        <w:pStyle w:val="ListParagraph"/>
-        <w:numPr>
-          <w:ilvl w:val="0"/>
-          <w:numId w:val="1"/>
-        </w:numPr>
-        <w:spacing w:after="40" w:before="40"/>
-      </w:pPr>
-      <w:r>
-        <w:t xml:space="preserve">"What are the key focus areas for the next twelve months? What comes up in every leadership conversation?"</w:t>
+        <w:t xml:space="preserve">"Tell me where SPECIFIC is right now, in your own words. What's going well, and what's the next hill to climb?"</w:t>
+      </w:r>
+    </w:p>
+    <w:p>
+      <w:pPr>
+        <w:pStyle w:val="ListParagraph"/>
+        <w:numPr>
+          <w:ilvl w:val="0"/>
+          <w:numId w:val="1"/>
+        </w:numPr>
+        <w:spacing w:after="40" w:before="40"/>
+      </w:pPr>
+      <w:r>
+        <w:t xml:space="preserve">"Where does nutrition sit in Dechra's plan for the next few years? Is it a growth bet, or a support act for the medicines?"</w:t>
       </w:r>
     </w:p>
     <w:p>
@@ -1317,20 +1399,20 @@
         <w:spacing w:after="40" w:before="40"/>
       </w:pPr>
       <w:r>
-        <w:t xml:space="preserve">"How do you see something like Formula 1, or sport at all, maybe playing a role in where Dechra is headed? Even a rough first instinct helps, and 'it doesn't' is a fine answer too."</w:t>
-      </w:r>
-    </w:p>
-    <w:p>
-      <w:pPr>
-        <w:pStyle w:val="ListParagraph"/>
-        <w:numPr>
-          <w:ilvl w:val="0"/>
-          <w:numId w:val="1"/>
-        </w:numPr>
-        <w:spacing w:after="40" w:before="40"/>
-      </w:pPr>
-      <w:r>
-        <w:t xml:space="preserve">"And as a business, where could you imagine it adding value, if anywhere: the big customer relationships, your own people, or the brand with pet owners?"</w:t>
+        <w:t xml:space="preserve">"How do you see something like Formula 1, or sport at all, maybe playing a role in where the brand is headed? Even a rough first instinct helps, and 'it doesn't' is a fine answer too."</w:t>
+      </w:r>
+    </w:p>
+    <w:p>
+      <w:pPr>
+        <w:pStyle w:val="ListParagraph"/>
+        <w:numPr>
+          <w:ilvl w:val="0"/>
+          <w:numId w:val="1"/>
+        </w:numPr>
+        <w:spacing w:after="40" w:before="40"/>
+      </w:pPr>
+      <w:r>
+        <w:t xml:space="preserve">"And as a business, where could you imagine it adding value, if anywhere: with vets, with pet owners, or with your own people?"</w:t>
       </w:r>
     </w:p>
     <w:p>
@@ -1342,33 +1424,33 @@
           <w:b/>
           <w:bCs/>
         </w:rPr>
-        <w:t xml:space="preserve">The new chapter</w:t>
-      </w:r>
-    </w:p>
-    <w:p>
-      <w:pPr>
-        <w:pStyle w:val="ListParagraph"/>
-        <w:numPr>
-          <w:ilvl w:val="0"/>
-          <w:numId w:val="1"/>
-        </w:numPr>
-        <w:spacing w:after="40" w:before="40"/>
-      </w:pPr>
-      <w:r>
-        <w:t xml:space="preserve">"From the outside, the last two years look like a lot of change: new owners, a new strategy, a move to Boston. How has that landed inside the company?"</w:t>
-      </w:r>
-    </w:p>
-    <w:p>
-      <w:pPr>
-        <w:pStyle w:val="ListParagraph"/>
-        <w:numPr>
-          <w:ilvl w:val="0"/>
-          <w:numId w:val="1"/>
-        </w:numPr>
-        <w:spacing w:after="40" w:before="40"/>
-      </w:pPr>
-      <w:r>
-        <w:t xml:space="preserve">"What would make your people proud to work at Dechra next year? And is hiring and keeping good people a big topic right now?"</w:t>
+        <w:t xml:space="preserve">How the sale really happens</w:t>
+      </w:r>
+    </w:p>
+    <w:p>
+      <w:pPr>
+        <w:pStyle w:val="ListParagraph"/>
+        <w:numPr>
+          <w:ilvl w:val="0"/>
+          <w:numId w:val="1"/>
+        </w:numPr>
+        <w:spacing w:after="40" w:before="40"/>
+      </w:pPr>
+      <w:r>
+        <w:t xml:space="preserve">"Walk me through how a pet ends up on SPECIFIC. Who starts that conversation in the clinic: the vet, the vet nurse, or the owner asking?"</w:t>
+      </w:r>
+    </w:p>
+    <w:p>
+      <w:pPr>
+        <w:pStyle w:val="ListParagraph"/>
+        <w:numPr>
+          <w:ilvl w:val="0"/>
+          <w:numId w:val="1"/>
+        </w:numPr>
+        <w:spacing w:after="40" w:before="40"/>
+      </w:pPr>
+      <w:r>
+        <w:t xml:space="preserve">"What makes a clinic recommend you over the big names? And what's the hardest part of winning a clinic today?"</w:t>
       </w:r>
     </w:p>
     <w:p>
@@ -1380,6 +1462,69 @@
           <w:b/>
           <w:bCs/>
         </w:rPr>
+        <w:t xml:space="preserve">Pet owners</w:t>
+      </w:r>
+    </w:p>
+    <w:p>
+      <w:pPr>
+        <w:pStyle w:val="ListParagraph"/>
+        <w:numPr>
+          <w:ilvl w:val="0"/>
+          <w:numId w:val="1"/>
+        </w:numPr>
+        <w:spacing w:after="40" w:before="40"/>
+      </w:pPr>
+      <w:r>
+        <w:t xml:space="preserve">"How much do you want pet owners to know the name SPECIFIC, given you sell through vets? Would owners walking in and asking for it help you, or would it cause friction with clinics?"</w:t>
+      </w:r>
+    </w:p>
+    <w:p>
+      <w:pPr>
+        <w:pStyle w:val="ListParagraph"/>
+        <w:numPr>
+          <w:ilvl w:val="0"/>
+          <w:numId w:val="1"/>
+        </w:numPr>
+        <w:spacing w:after="40" w:before="40"/>
+      </w:pPr>
+      <w:r>
+        <w:t xml:space="preserve">"And what are the rules you live by on what you can say to owners about diets that support a condition? They change by country, and I'd rather know now."</w:t>
+      </w:r>
+    </w:p>
+    <w:p>
+      <w:pPr>
+        <w:spacing w:after="80" w:before="80"/>
+      </w:pPr>
+      <w:r>
+        <w:rPr>
+          <w:b/>
+          <w:bCs/>
+        </w:rPr>
+        <w:t xml:space="preserve">Markets</w:t>
+      </w:r>
+    </w:p>
+    <w:p>
+      <w:pPr>
+        <w:pStyle w:val="ListParagraph"/>
+        <w:numPr>
+          <w:ilvl w:val="0"/>
+          <w:numId w:val="1"/>
+        </w:numPr>
+        <w:spacing w:after="40" w:before="40"/>
+      </w:pPr>
+      <w:r>
+        <w:t xml:space="preserve">"Which markets matter most for SPECIFIC today? Is it mainly Europe, and is North America part of the plan?"</w:t>
+      </w:r>
+    </w:p>
+    <w:p>
+      <w:pPr>
+        <w:spacing w:after="80" w:before="80"/>
+      </w:pPr>
+      <w:r>
+        <w:rPr>
+          <w:b/>
+          <w:bCs/>
+        </w:rPr>
         <w:t xml:space="preserve">The end goal</w:t>
       </w:r>
     </w:p>
@@ -1393,7 +1538,7 @@
         <w:spacing w:after="40" w:before="40"/>
       </w:pPr>
       <w:r>
-        <w:t xml:space="preserve">"Zooming out: if Dechra 2030 goes right, what does the company look like?"</w:t>
+        <w:t xml:space="preserve">"Zooming out: if everything goes right for nutrition over the next three years, what does SPECIFIC look like?"</w:t>
       </w:r>
     </w:p>
     <w:p>
@@ -1444,20 +1589,7 @@
         <w:spacing w:after="40" w:before="40"/>
       </w:pPr>
       <w:r>
-        <w:t xml:space="preserve">"What do your owners need to see to say yes to something outside the core plan? And how far ahead do they think: two years, five?"</w:t>
-      </w:r>
-    </w:p>
-    <w:p>
-      <w:pPr>
-        <w:pStyle w:val="ListParagraph"/>
-        <w:numPr>
-          <w:ilvl w:val="0"/>
-          <w:numId w:val="1"/>
-        </w:numPr>
-        <w:spacing w:after="40" w:before="40"/>
-      </w:pPr>
-      <w:r>
-        <w:t xml:space="preserve">"Is anything off the table while the transformation is running? Better I know now."</w:t>
+        <w:t xml:space="preserve">"Would something like this come out of a nutrition budget, or would it need group backing?"</w:t>
       </w:r>
     </w:p>
     <w:p>
@@ -1482,7 +1614,7 @@
         <w:spacing w:after="40" w:before="40"/>
       </w:pPr>
       <w:r>
-        <w:t xml:space="preserve">"If you ever did something like this, on what basis would it be judged internally, and by whom?"</w:t>
+        <w:t xml:space="preserve">"If you ever did something like this, on what basis would it be judged, and by whom?"</w:t>
       </w:r>
     </w:p>
     <w:p>
@@ -1507,46 +1639,33 @@
           <w:b/>
           <w:bCs/>
         </w:rPr>
-        <w:t xml:space="preserve">Customers and buyers</w:t>
-      </w:r>
-    </w:p>
-    <w:p>
-      <w:pPr>
-        <w:pStyle w:val="ListParagraph"/>
-        <w:numPr>
-          <w:ilvl w:val="0"/>
-          <w:numId w:val="1"/>
-        </w:numPr>
-        <w:spacing w:after="40" w:before="40"/>
-      </w:pPr>
-      <w:r>
-        <w:t xml:space="preserve">"Who are the relationships that decide your year? I'm guessing it's a fairly small number of big vet groups and distributors. Is that fair?"</w:t>
-      </w:r>
-    </w:p>
-    <w:p>
-      <w:pPr>
-        <w:pStyle w:val="ListParagraph"/>
-        <w:numPr>
-          <w:ilvl w:val="0"/>
-          <w:numId w:val="1"/>
-        </w:numPr>
-        <w:spacing w:after="40" w:before="40"/>
-      </w:pPr>
-      <w:r>
-        <w:t xml:space="preserve">"How do you look after those people today: conferences, education, dinners? What works best, and what's getting harder?"</w:t>
-      </w:r>
-    </w:p>
-    <w:p>
-      <w:pPr>
-        <w:pStyle w:val="ListParagraph"/>
-        <w:numPr>
-          <w:ilvl w:val="0"/>
-          <w:numId w:val="1"/>
-        </w:numPr>
-        <w:spacing w:after="40" w:before="40"/>
-      </w:pPr>
-      <w:r>
-        <w:t xml:space="preserve">"And where do pet owners sit for you? Do you want them to know the name Dechra, or is it enough that their vet does?"</w:t>
+        <w:t xml:space="preserve">Brand and marketing today</w:t>
+      </w:r>
+    </w:p>
+    <w:p>
+      <w:pPr>
+        <w:pStyle w:val="ListParagraph"/>
+        <w:numPr>
+          <w:ilvl w:val="0"/>
+          <w:numId w:val="1"/>
+        </w:numPr>
+        <w:spacing w:after="40" w:before="40"/>
+      </w:pPr>
+      <w:r>
+        <w:t xml:space="preserve">"How do you market SPECIFIC today? I'd guess mostly through your field teams, the Academy, clinic materials and the big vet conferences. What else?"</w:t>
+      </w:r>
+    </w:p>
+    <w:p>
+      <w:pPr>
+        <w:pStyle w:val="ListParagraph"/>
+        <w:numPr>
+          <w:ilvl w:val="0"/>
+          <w:numId w:val="1"/>
+        </w:numPr>
+        <w:spacing w:after="40" w:before="40"/>
+      </w:pPr>
+      <w:r>
+        <w:t xml:space="preserve">"Is the bigger job right now top of the funnel or bottom of the funnel: being known by clinics and owners who've never heard of SPECIFIC, or going deeper with the clinics who already recommend it?"</w:t>
       </w:r>
     </w:p>
     <w:p>
@@ -1558,20 +1677,33 @@
           <w:b/>
           <w:bCs/>
         </w:rPr>
-        <w:t xml:space="preserve">Markets</w:t>
-      </w:r>
-    </w:p>
-    <w:p>
-      <w:pPr>
-        <w:pStyle w:val="ListParagraph"/>
-        <w:numPr>
-          <w:ilvl w:val="0"/>
-          <w:numId w:val="1"/>
-        </w:numPr>
-        <w:spacing w:after="40" w:before="40"/>
-      </w:pPr>
-      <w:r>
-        <w:t xml:space="preserve">"Where's the growth focus: North America, Europe, or both? The calendar runs on five continents, and the US alone has three races."</w:t>
+        <w:t xml:space="preserve">Budget and timing</w:t>
+      </w:r>
+    </w:p>
+    <w:p>
+      <w:pPr>
+        <w:pStyle w:val="ListParagraph"/>
+        <w:numPr>
+          <w:ilvl w:val="0"/>
+          <w:numId w:val="1"/>
+        </w:numPr>
+        <w:spacing w:after="40" w:before="40"/>
+      </w:pPr>
+      <w:r>
+        <w:t xml:space="preserve">"The unromantic question: is there a budget range in mind for something like this? I ask early because it decides which doors we even look at, and it saves us both time."</w:t>
+      </w:r>
+    </w:p>
+    <w:p>
+      <w:pPr>
+        <w:pStyle w:val="ListParagraph"/>
+        <w:numPr>
+          <w:ilvl w:val="0"/>
+          <w:numId w:val="1"/>
+        </w:numPr>
+        <w:spacing w:after="40" w:before="40"/>
+      </w:pPr>
+      <w:r>
+        <w:t xml:space="preserve">"And timing: is this a now conversation or a next-year conversation? Both are fine; they just change what we bring back."</w:t>
       </w:r>
     </w:p>
     <w:p>
@@ -1583,95 +1715,6 @@
           <w:b/>
           <w:bCs/>
         </w:rPr>
-        <w:t xml:space="preserve">Brand and marketing today</w:t>
-      </w:r>
-    </w:p>
-    <w:p>
-      <w:pPr>
-        <w:pStyle w:val="ListParagraph"/>
-        <w:numPr>
-          <w:ilvl w:val="0"/>
-          <w:numId w:val="1"/>
-        </w:numPr>
-        <w:spacing w:after="40" w:before="40"/>
-      </w:pPr>
-      <w:r>
-        <w:t xml:space="preserve">"How does Dechra market today? I'd guess mostly through your field teams, the Academy and the big vet conferences. What else?"</w:t>
-      </w:r>
-    </w:p>
-    <w:p>
-      <w:pPr>
-        <w:pStyle w:val="ListParagraph"/>
-        <w:numPr>
-          <w:ilvl w:val="0"/>
-          <w:numId w:val="1"/>
-        </w:numPr>
-        <w:spacing w:after="40" w:before="40"/>
-      </w:pPr>
-      <w:r>
-        <w:t xml:space="preserve">"Is the bigger job right now top of the funnel or bottom of the funnel: being known by people who've never heard of Dechra, or going deeper with the vets and groups who already buy from you?"</w:t>
-      </w:r>
-    </w:p>
-    <w:p>
-      <w:pPr>
-        <w:pStyle w:val="ListParagraph"/>
-        <w:numPr>
-          <w:ilvl w:val="0"/>
-          <w:numId w:val="1"/>
-        </w:numPr>
-        <w:spacing w:after="40" w:before="40"/>
-      </w:pPr>
-      <w:r>
-        <w:t xml:space="preserve">"And what are the rules you live by? I know there are limits on talking about prescription medicines to the public, and they change by country."</w:t>
-      </w:r>
-    </w:p>
-    <w:p>
-      <w:pPr>
-        <w:spacing w:after="80" w:before="80"/>
-      </w:pPr>
-      <w:r>
-        <w:rPr>
-          <w:b/>
-          <w:bCs/>
-        </w:rPr>
-        <w:t xml:space="preserve">Budget and timing</w:t>
-      </w:r>
-    </w:p>
-    <w:p>
-      <w:pPr>
-        <w:pStyle w:val="ListParagraph"/>
-        <w:numPr>
-          <w:ilvl w:val="0"/>
-          <w:numId w:val="1"/>
-        </w:numPr>
-        <w:spacing w:after="40" w:before="40"/>
-      </w:pPr>
-      <w:r>
-        <w:t xml:space="preserve">"The unromantic question: is there a budget range in mind for something like this? I ask early because it decides which doors we even look at, and it saves us both time."</w:t>
-      </w:r>
-    </w:p>
-    <w:p>
-      <w:pPr>
-        <w:pStyle w:val="ListParagraph"/>
-        <w:numPr>
-          <w:ilvl w:val="0"/>
-          <w:numId w:val="1"/>
-        </w:numPr>
-        <w:spacing w:after="40" w:before="40"/>
-      </w:pPr>
-      <w:r>
-        <w:t xml:space="preserve">"And timing: is this a now conversation or a next-year conversation? Both are fine; they just change what we bring back."</w:t>
-      </w:r>
-    </w:p>
-    <w:p>
-      <w:pPr>
-        <w:spacing w:after="80" w:before="80"/>
-      </w:pPr>
-      <w:r>
-        <w:rPr>
-          <w:b/>
-          <w:bCs/>
-        </w:rPr>
         <w:t xml:space="preserve">Decision process</w:t>
       </w:r>
     </w:p>
@@ -1685,7 +1728,7 @@
         <w:spacing w:after="40" w:before="40"/>
       </w:pPr>
       <w:r>
-        <w:t xml:space="preserve">"Apart from you, who'd be part of this decision? Jesper and the leadership team, finance, your owners?"</w:t>
+        <w:t xml:space="preserve">"Apart from you, who'd be part of this decision? The leadership team, finance, your owners?"</w:t>
       </w:r>
     </w:p>
     <w:p>
@@ -1836,7 +1879,7 @@
         <w:rPr>
           <w:color w:val="1F3864"/>
         </w:rPr>
-        <w:t xml:space="preserve">So a brand can enter at three levels: the sport, a team, or a driver personally. They come in very different sizes, and for Dechra I'd be straight from the start: the interesting doors are the small ones."</w:t>
+        <w:t xml:space="preserve">So a brand can enter at three levels: the sport, a team, or a driver personally. They come in very different sizes, and for SPECIFIC I'd be straight from the start: the interesting doors are the small ones."</w:t>
       </w:r>
     </w:p>
     <w:p>
@@ -1913,7 +1956,7 @@
         <w:rPr>
           <w:color w:val="1F3864"/>
         </w:rPr>
-        <w:t xml:space="preserve"> Official Something Partner of the team, usable in your own marketing and your customer conversations.</w:t>
+        <w:t xml:space="preserve"> Official Something Partner of the team, usable in your own marketing and your clinic conversations.</w:t>
       </w:r>
     </w:p>
     <w:p>
@@ -1997,7 +2040,7 @@
         <w:rPr>
           <w:color w:val="1F3864"/>
         </w:rPr>
-        <w:t xml:space="preserve">And around it all, the business platform: 25-plus partners per team, 350-plus across the grid. For Dechra I'd see that as a bonus, not the main event."</w:t>
+        <w:t xml:space="preserve">And around it all, the business platform: 25-plus partners per team, 350-plus across the grid. For SPECIFIC I'd see that as a bonus, not the main event."</w:t>
       </w:r>
     </w:p>
     <w:p>
@@ -2026,45 +2069,68 @@
           <w:iCs/>
           <w:color w:val="7F7F7F"/>
         </w:rPr>
-        <w:t xml:space="preserve">[Three possible audiences for Dechra. Say which ones you're sure about and which you're not.]</w:t>
-      </w:r>
-    </w:p>
-    <w:p>
-      <w:pPr>
-        <w:pBdr>
-          <w:left w:val="single" w:color="2E74B5" w:sz="18" w:space="12"/>
-        </w:pBdr>
-        <w:spacing w:after="60" w:before="60"/>
-        <w:ind w:left="420"/>
-      </w:pPr>
-      <w:r>
-        <w:rPr>
-          <w:color w:val="1F3864"/>
-        </w:rPr>
-        <w:t xml:space="preserve">"Who you reach. For Dechra it's three groups, and I'll tell you how sure I am about each.</w:t>
-      </w:r>
-    </w:p>
-    <w:p>
-      <w:pPr>
-        <w:pBdr>
-          <w:left w:val="single" w:color="2E74B5" w:sz="18" w:space="12"/>
-        </w:pBdr>
-        <w:spacing w:after="60" w:before="60"/>
-        <w:ind w:left="420"/>
-      </w:pPr>
-      <w:r>
-        <w:rPr>
-          <w:b/>
-          <w:bCs/>
-          <w:color w:val="1F3864"/>
-        </w:rPr>
-        <w:t xml:space="preserve">The decision makers.</w:t>
-      </w:r>
-      <w:r>
-        <w:rPr>
-          <w:color w:val="1F3864"/>
-        </w:rPr>
-        <w:t xml:space="preserve"> This one's solid. Formula 1 has the highest concentration of business decision makers in sport, index 160 against 100 for the general population, and two thirds of Paddock Club guests are senior executives. If your key buyers are the people running big vet groups and distribution businesses, this is an invitation they'd say yes to.</w:t>
+        <w:t xml:space="preserve">[Three possible audiences. Say which ones you're sure about and which you're not.]</w:t>
+      </w:r>
+    </w:p>
+    <w:p>
+      <w:pPr>
+        <w:pBdr>
+          <w:left w:val="single" w:color="2E74B5" w:sz="18" w:space="12"/>
+        </w:pBdr>
+        <w:spacing w:after="60" w:before="60"/>
+        <w:ind w:left="420"/>
+      </w:pPr>
+      <w:r>
+        <w:rPr>
+          <w:color w:val="1F3864"/>
+        </w:rPr>
+        <w:t xml:space="preserve">"Who you reach. For SPECIFIC it's three groups, and I'll tell you how sure I am about each.</w:t>
+      </w:r>
+    </w:p>
+    <w:p>
+      <w:pPr>
+        <w:pBdr>
+          <w:left w:val="single" w:color="2E74B5" w:sz="18" w:space="12"/>
+        </w:pBdr>
+        <w:spacing w:after="60" w:before="60"/>
+        <w:ind w:left="420"/>
+      </w:pPr>
+      <w:r>
+        <w:rPr>
+          <w:b/>
+          <w:bCs/>
+          <w:color w:val="1F3864"/>
+        </w:rPr>
+        <w:t xml:space="preserve">The people who recommend you.</w:t>
+      </w:r>
+      <w:r>
+        <w:rPr>
+          <w:color w:val="1F3864"/>
+        </w:rPr>
+        <w:t xml:space="preserve"> This one's solid. If the clinics, the big vet groups and your distributors decide your year, a race weekend is an invitation they'd say yes to, and two thirds of Paddock Club guests are senior executives. Three days together beats thirty minutes at a conference stand.</w:t>
+      </w:r>
+    </w:p>
+    <w:p>
+      <w:pPr>
+        <w:pBdr>
+          <w:left w:val="single" w:color="2E74B5" w:sz="18" w:space="12"/>
+        </w:pBdr>
+        <w:spacing w:after="60" w:before="60"/>
+        <w:ind w:left="420"/>
+      </w:pPr>
+      <w:r>
+        <w:rPr>
+          <w:b/>
+          <w:bCs/>
+          <w:color w:val="1F3864"/>
+        </w:rPr>
+        <w:t xml:space="preserve">Pet owners, in the right markets.</w:t>
+      </w:r>
+      <w:r>
+        <w:rPr>
+          <w:color w:val="1F3864"/>
+        </w:rPr>
+        <w:t xml:space="preserve"> 827 million fans, 42% women, 43% under 35. And here's the number that matters for pet food: F1 fans are number one in sport for brand loyalty, for buying premium, and for researching before they buy. That's how people choose food for an animal they love. But I don't have data on how many fans own pets, and I won't guess. That one's a test, not a promise.</w:t>
       </w:r>
     </w:p>
     <w:p>
@@ -2087,30 +2153,7 @@
         <w:rPr>
           <w:color w:val="1F3864"/>
         </w:rPr>
-        <w:t xml:space="preserve"> About twenty-seven hundred of them, in twenty-seven countries. The sport runs around 24 weekends on five continents, three of them in the US. That's a lot of shared moments for a company that's been through a lot of change.</w:t>
-      </w:r>
-    </w:p>
-    <w:p>
-      <w:pPr>
-        <w:pBdr>
-          <w:left w:val="single" w:color="2E74B5" w:sz="18" w:space="12"/>
-        </w:pBdr>
-        <w:spacing w:after="60" w:before="60"/>
-        <w:ind w:left="420"/>
-      </w:pPr>
-      <w:r>
-        <w:rPr>
-          <w:b/>
-          <w:bCs/>
-          <w:color w:val="1F3864"/>
-        </w:rPr>
-        <w:t xml:space="preserve">Pet owners, maybe.</w:t>
-      </w:r>
-      <w:r>
-        <w:rPr>
-          <w:color w:val="1F3864"/>
-        </w:rPr>
-        <w:t xml:space="preserve"> 827 million fans, 42% women, 43% under 35, and they're number one in sport for buying premium and for researching online before they buy. But I don't have data on how many fans own pets, and I won't guess. That one's a test, not a promise."</w:t>
+        <w:t xml:space="preserve"> About twenty-seven hundred across the group. The sport runs around 24 weekends on five continents. That's a lot of shared moments for a company that's been through a lot of change."</w:t>
       </w:r>
     </w:p>
     <w:p>
@@ -2126,7 +2169,7 @@
           <w:sz w:val="25"/>
           <w:szCs w:val="25"/>
         </w:rPr>
-        <w:t xml:space="preserve">4.4 Why this could fit Dechra</w:t>
+        <w:t xml:space="preserve">4.4 Why this could fit SPECIFIC</w:t>
       </w:r>
     </w:p>
     <w:p>
@@ -2164,68 +2207,68 @@
         <w:rPr>
           <w:color w:val="1F3864"/>
         </w:rPr>
-        <w:t xml:space="preserve"> Your own filing says it plainly: vet groups and buying groups are getting bigger, and those relationships matter more every year. When your buyers get fewer and bigger, three days with the right twenty people is worth more than any ad. Seven passes, twenty different guests, one weekend. That's a key account program, not a sponsorship.</w:t>
-      </w:r>
-    </w:p>
-    <w:p>
-      <w:pPr>
-        <w:pBdr>
-          <w:left w:val="single" w:color="2E74B5" w:sz="18" w:space="12"/>
-        </w:pBdr>
-        <w:spacing w:after="60" w:before="60"/>
-        <w:ind w:left="420"/>
-      </w:pPr>
-      <w:r>
-        <w:rPr>
-          <w:b/>
-          <w:bCs/>
-          <w:color w:val="1F3864"/>
-        </w:rPr>
-        <w:t xml:space="preserve">Two, pride, in a year of change.</w:t>
-      </w:r>
-      <w:r>
-        <w:rPr>
-          <w:color w:val="1F3864"/>
-        </w:rPr>
-        <w:t xml:space="preserve"> New owners, a new strategy, a new home in Boston. Changes like that can leave people unsure where they stand. A season gives your people something to follow and share together, week after week. It's not a reason on its own, but it adds up with the first one.</w:t>
-      </w:r>
-    </w:p>
-    <w:p>
-      <w:pPr>
-        <w:pBdr>
-          <w:left w:val="single" w:color="2E74B5" w:sz="18" w:space="12"/>
-        </w:pBdr>
-        <w:spacing w:after="60" w:before="60"/>
-        <w:ind w:left="420"/>
-      </w:pPr>
-      <w:r>
-        <w:rPr>
-          <w:b/>
-          <w:bCs/>
-          <w:color w:val="1F3864"/>
-        </w:rPr>
-        <w:t xml:space="preserve">Three, precision and care.</w:t>
-      </w:r>
-      <w:r>
-        <w:rPr>
-          <w:color w:val="1F3864"/>
-        </w:rPr>
-        <w:t xml:space="preserve"> A race team is a group of specialists looking after a machine that can't tell them what's wrong. They read the data, make small careful calls, and work under strict rules. That's not far from a vet team with a patient that can't talk. There may be a story there, for vets and maybe for pet owners in the US. This is the one I'm least sure about, and I'd want to test it with you.</w:t>
-      </w:r>
-    </w:p>
-    <w:p>
-      <w:pPr>
-        <w:pBdr>
-          <w:left w:val="single" w:color="2E74B5" w:sz="18" w:space="12"/>
-        </w:pBdr>
-        <w:spacing w:after="60" w:before="60"/>
-        <w:ind w:left="420"/>
-      </w:pPr>
-      <w:r>
-        <w:rPr>
-          <w:color w:val="1F3864"/>
-        </w:rPr>
-        <w:t xml:space="preserve">One honest note. A full team seat is a big number for a business that markets mainly through vets, and under your owners every investment needs a payback case. So we'd start with the smallest thing that could prove itself, most likely the room, and only build if it works. And if the numbers don't pass your owners' test, we'll be the first to say so."</w:t>
+        <w:t xml:space="preserve"> Your own filing says it: vet groups and buying groups are getting bigger, and those relationships matter more every year. If a handful of groups decide which diets their clinics recommend, three days with the right twenty people is worth more than any ad. Seven passes, twenty different guests, one weekend.</w:t>
+      </w:r>
+    </w:p>
+    <w:p>
+      <w:pPr>
+        <w:pBdr>
+          <w:left w:val="single" w:color="2E74B5" w:sz="18" w:space="12"/>
+        </w:pBdr>
+        <w:spacing w:after="60" w:before="60"/>
+        <w:ind w:left="420"/>
+      </w:pPr>
+      <w:r>
+        <w:rPr>
+          <w:b/>
+          <w:bCs/>
+          <w:color w:val="1F3864"/>
+        </w:rPr>
+        <w:t xml:space="preserve">Two, what goes in decides what comes out.</w:t>
+      </w:r>
+      <w:r>
+        <w:rPr>
+          <w:color w:val="1F3864"/>
+        </w:rPr>
+        <w:t xml:space="preserve"> Formula 1 is obsessed with what goes into the machine and the person driving it. The 2026 cars run on fully sustainable fuel, and teams bring in specialist nutrition partners for their drivers. SPECIFIC is the same belief, for pets: the right nutrition, for a specific need, chosen with an expert. That's a story vets and vet nurses would get in one sentence.</w:t>
+      </w:r>
+    </w:p>
+    <w:p>
+      <w:pPr>
+        <w:pBdr>
+          <w:left w:val="single" w:color="2E74B5" w:sz="18" w:space="12"/>
+        </w:pBdr>
+        <w:spacing w:after="60" w:before="60"/>
+        <w:ind w:left="420"/>
+      </w:pPr>
+      <w:r>
+        <w:rPr>
+          <w:b/>
+          <w:bCs/>
+          <w:color w:val="1F3864"/>
+        </w:rPr>
+        <w:t xml:space="preserve">Three, owners who research and stay loyal.</w:t>
+      </w:r>
+      <w:r>
+        <w:rPr>
+          <w:color w:val="1F3864"/>
+        </w:rPr>
+        <w:t xml:space="preserve"> Premium pet food is bought by people who read labels and stick with what works. That's exactly how F1 fans shop. If owners walking into a clinic and asking about SPECIFIC helps you, there may be something here, in Europe first, within the rules. This is the one I'm least sure about.</w:t>
+      </w:r>
+    </w:p>
+    <w:p>
+      <w:pPr>
+        <w:pBdr>
+          <w:left w:val="single" w:color="2E74B5" w:sz="18" w:space="12"/>
+        </w:pBdr>
+        <w:spacing w:after="60" w:before="60"/>
+        <w:ind w:left="420"/>
+      </w:pPr>
+      <w:r>
+        <w:rPr>
+          <w:color w:val="1F3864"/>
+        </w:rPr>
+        <w:t xml:space="preserve">One honest note. Nutrition is a smaller part of Dechra, and under your owners every investment needs a payback case. So we'd start with the smallest thing that could prove itself, most likely the room or a content piece, and only build if it works. And if the numbers don't pass your owners' test, we'll be the first to say so."</w:t>
       </w:r>
     </w:p>
     <w:p>
@@ -2269,76 +2312,76 @@
         <w:rPr>
           <w:color w:val="1F3864"/>
         </w:rPr>
-        <w:t xml:space="preserve">"To make it concrete, three sketches, all sized for Dechra on purpose. Ideas, not proposals.</w:t>
-      </w:r>
-    </w:p>
-    <w:p>
-      <w:pPr>
-        <w:pBdr>
-          <w:left w:val="single" w:color="2E74B5" w:sz="18" w:space="12"/>
-        </w:pBdr>
-        <w:spacing w:after="60" w:before="60"/>
-        <w:ind w:left="420"/>
-      </w:pPr>
-      <w:r>
-        <w:rPr>
-          <w:b/>
-          <w:bCs/>
-          <w:color w:val="1F3864"/>
-        </w:rPr>
-        <w:t xml:space="preserve">One, the buyers' weekend.</w:t>
-      </w:r>
-      <w:r>
-        <w:rPr>
-          <w:color w:val="1F3864"/>
-        </w:rPr>
-        <w:t xml:space="preserve"> A hospitality program at two or three races, say one in Europe and one in the US: the owners and leaders of your biggest vet groups and distributors, hosted properly, with your leadership in the room. Seven passes, twenty guests a weekend, no logo needed. Pure hospitality sits below the price of a team deal.</w:t>
-      </w:r>
-    </w:p>
-    <w:p>
-      <w:pPr>
-        <w:pBdr>
-          <w:left w:val="single" w:color="2E74B5" w:sz="18" w:space="12"/>
-        </w:pBdr>
-        <w:spacing w:after="60" w:before="60"/>
-        <w:ind w:left="420"/>
-      </w:pPr>
-      <w:r>
-        <w:rPr>
-          <w:b/>
-          <w:bCs/>
-          <w:color w:val="1F3864"/>
-        </w:rPr>
-        <w:t xml:space="preserve">Two, the team behind the patient.</w:t>
-      </w:r>
-      <w:r>
-        <w:rPr>
-          <w:color w:val="1F3864"/>
-        </w:rPr>
-        <w:t xml:space="preserve"> A content and learning series with a team: how a race crew works under pressure, plans, checks and hands over, set next to how a clinic team does the same. Built for vets and vet nurses through your Academy, and for your own people. It speaks to vet teams' working lives, which you already care about through Not One More Vet.</w:t>
-      </w:r>
-    </w:p>
-    <w:p>
-      <w:pPr>
-        <w:pBdr>
-          <w:left w:val="single" w:color="2E74B5" w:sz="18" w:space="12"/>
-        </w:pBdr>
-        <w:spacing w:after="60" w:before="60"/>
-        <w:ind w:left="420"/>
-      </w:pPr>
-      <w:r>
-        <w:rPr>
-          <w:b/>
-          <w:bCs/>
-          <w:color w:val="1F3864"/>
-        </w:rPr>
-        <w:t xml:space="preserve">Three, the owner story, US first.</w:t>
-      </w:r>
-      <w:r>
-        <w:rPr>
-          <w:color w:val="1F3864"/>
-        </w:rPr>
-        <w:t xml:space="preserve"> Only if the first two prove out and the rules allow it: a small content or driver program for pet owners in the US, about the care it takes to look after something you love. Small, measured, and only where you're allowed to talk to owners."</w:t>
+        <w:t xml:space="preserve">"To make it concrete, three sketches, all sized for SPECIFIC on purpose. Ideas, not proposals.</w:t>
+      </w:r>
+    </w:p>
+    <w:p>
+      <w:pPr>
+        <w:pBdr>
+          <w:left w:val="single" w:color="2E74B5" w:sz="18" w:space="12"/>
+        </w:pBdr>
+        <w:spacing w:after="60" w:before="60"/>
+        <w:ind w:left="420"/>
+      </w:pPr>
+      <w:r>
+        <w:rPr>
+          <w:b/>
+          <w:bCs/>
+          <w:color w:val="1F3864"/>
+        </w:rPr>
+        <w:t xml:space="preserve">One, the clinic weekend.</w:t>
+      </w:r>
+      <w:r>
+        <w:rPr>
+          <w:color w:val="1F3864"/>
+        </w:rPr>
+        <w:t xml:space="preserve"> A hospitality program at one or two European races: the owners and leaders of your biggest vet groups and distributors, plus a few of your strongest nutrition clinics, hosted properly, with your team in the room. Seven passes, twenty guests a weekend, no logo needed. Pure hospitality sits well below the price of a team deal.</w:t>
+      </w:r>
+    </w:p>
+    <w:p>
+      <w:pPr>
+        <w:pBdr>
+          <w:left w:val="single" w:color="2E74B5" w:sz="18" w:space="12"/>
+        </w:pBdr>
+        <w:spacing w:after="60" w:before="60"/>
+        <w:ind w:left="420"/>
+      </w:pPr>
+      <w:r>
+        <w:rPr>
+          <w:b/>
+          <w:bCs/>
+          <w:color w:val="1F3864"/>
+        </w:rPr>
+        <w:t xml:space="preserve">Two, 'what goes in'.</w:t>
+      </w:r>
+      <w:r>
+        <w:rPr>
+          <w:color w:val="1F3864"/>
+        </w:rPr>
+        <w:t xml:space="preserve"> A content series with a team: how a race team plans exactly what goes into the car and the driver, set next to how a vet team plans nutrition for a pet with a specific need. Built for vets and vet nurses through your Academy and clinic materials. Simple, science-led, and it fits how SPECIFIC already talks.</w:t>
+      </w:r>
+    </w:p>
+    <w:p>
+      <w:pPr>
+        <w:pBdr>
+          <w:left w:val="single" w:color="2E74B5" w:sz="18" w:space="12"/>
+        </w:pBdr>
+        <w:spacing w:after="60" w:before="60"/>
+        <w:ind w:left="420"/>
+      </w:pPr>
+      <w:r>
+        <w:rPr>
+          <w:b/>
+          <w:bCs/>
+          <w:color w:val="1F3864"/>
+        </w:rPr>
+        <w:t xml:space="preserve">Three, the owner story, Europe first.</w:t>
+      </w:r>
+      <w:r>
+        <w:rPr>
+          <w:color w:val="1F3864"/>
+        </w:rPr>
+        <w:t xml:space="preserve"> Only if the first two prove out and the rules allow it: a small content or ambassador program for pet owners about the care that goes into what they feed the animals they love, ending with 'ask your vet'. No condition claims, no shop links, nothing that breaks your channel."</w:t>
       </w:r>
     </w:p>
     <w:p>
@@ -2479,7 +2522,7 @@
         <w:spacing w:after="40" w:before="40"/>
       </w:pPr>
       <w:r>
-        <w:t xml:space="preserve">Q8. We're a vet pharma company; what has F1 got to do with animals</w:t>
+        <w:t xml:space="preserve">Q8. We sell pet food through vets, not in shops; why would 827 million fans matter</w:t>
       </w:r>
     </w:p>
     <w:p>
@@ -2510,37 +2553,37 @@
         <w:rPr>
           <w:color w:val="1F3864"/>
         </w:rPr>
-        <w:t xml:space="preserve">"Good question, and I'll be straight: I can't point you to an animal health company in the sport, and I won't make one up. What I can show you is the pattern for businesses that sell to professionals, not the public.</w:t>
-      </w:r>
-    </w:p>
-    <w:p>
-      <w:pPr>
-        <w:pBdr>
-          <w:left w:val="single" w:color="2E74B5" w:sz="18" w:space="12"/>
-        </w:pBdr>
-        <w:spacing w:after="60" w:before="60"/>
-        <w:ind w:left="420"/>
-      </w:pPr>
-      <w:r>
-        <w:rPr>
-          <w:color w:val="1F3864"/>
-        </w:rPr>
-        <w:t xml:space="preserve">B2B names like Cognizant, ServiceNow, NetApp and Tata Communications sit around the grid. Technogym, a specialist fitness brand, has been McLaren's fitness partner since 2004. That's more than twenty years with one team.</w:t>
-      </w:r>
-    </w:p>
-    <w:p>
-      <w:pPr>
-        <w:pBdr>
-          <w:left w:val="single" w:color="2E74B5" w:sz="18" w:space="12"/>
-        </w:pBdr>
-        <w:spacing w:after="60" w:before="60"/>
-        <w:ind w:left="420"/>
-      </w:pPr>
-      <w:r>
-        <w:rPr>
-          <w:color w:val="1F3864"/>
-        </w:rPr>
-        <w:t xml:space="preserve">Why do they do it? Three jobs, usually. Trust: their name next to serious engineering. The room: hosting the people they sell to, race after race. And proof: CommScope's RUCKUS brand provides the enterprise wireless that powers the Haas team's operations, with a live showcase in the garage.</w:t>
+        <w:t xml:space="preserve">"Good question. I won't name pet food brands in the sport from memory; that's part of the mapping we do properly. What I can show you is the pattern for nutrition and specialist brands.</w:t>
+      </w:r>
+    </w:p>
+    <w:p>
+      <w:pPr>
+        <w:pBdr>
+          <w:left w:val="single" w:color="2E74B5" w:sz="18" w:space="12"/>
+        </w:pBdr>
+        <w:spacing w:after="60" w:before="60"/>
+        <w:ind w:left="420"/>
+      </w:pPr>
+      <w:r>
+        <w:rPr>
+          <w:color w:val="1F3864"/>
+        </w:rPr>
+        <w:t xml:space="preserve">Nutrition already has a seat in the paddock: Optimum Nutrition is McLaren's sports nutrition partner this year. Technogym, a specialist fitness brand, has been McLaren's fitness partner since 2004. That's more than twenty years with one team. And brands that sell to professionals, not the public, like Cognizant, ServiceNow, NetApp and Tata Communications, sit around the grid too.</w:t>
+      </w:r>
+    </w:p>
+    <w:p>
+      <w:pPr>
+        <w:pBdr>
+          <w:left w:val="single" w:color="2E74B5" w:sz="18" w:space="12"/>
+        </w:pBdr>
+        <w:spacing w:after="60" w:before="60"/>
+        <w:ind w:left="420"/>
+      </w:pPr>
+      <w:r>
+        <w:rPr>
+          <w:color w:val="1F3864"/>
+        </w:rPr>
+        <w:t xml:space="preserve">Why do they do it? Three jobs, usually. Trust: their name next to the most demanding performance environment there is. The room: hosting the people they sell to, race after race. And proof: CommScope's RUCKUS brand provides the wireless that powers the Haas team's operations, with a live showcase in the garage.</w:t>
       </w:r>
     </w:p>
     <w:p>
@@ -2616,7 +2659,7 @@
         <w:rPr>
           <w:color w:val="1F3864"/>
         </w:rPr>
-        <w:t xml:space="preserve">For Dechra I'd be straight: the partner network is a nice extra. The real value is your own guests. The vet group owners and distributors you'd bring are the point, and a race gives you three days with them instead of thirty minutes at a conference stand."</w:t>
+        <w:t xml:space="preserve">For SPECIFIC I'd be straight: the partner network is a nice extra. The real value is your own guests. The vet group owners, distributors and clinic leaders you'd bring are the point."</w:t>
       </w:r>
     </w:p>
     <w:p>
@@ -2664,36 +2707,13 @@
           <w:bCs/>
           <w:color w:val="1F3864"/>
         </w:rPr>
-        <w:t xml:space="preserve">Relationship pipeline:</w:t>
-      </w:r>
-      <w:r>
-        <w:rPr>
-          <w:color w:val="1F3864"/>
-        </w:rPr>
-        <w:t xml:space="preserve"> for Dechra this comes first. Which accounts you hosted, what happened with them over the next year, and what that's worth.</w:t>
-      </w:r>
-    </w:p>
-    <w:p>
-      <w:pPr>
-        <w:pBdr>
-          <w:left w:val="single" w:color="2E74B5" w:sz="18" w:space="12"/>
-        </w:pBdr>
-        <w:spacing w:after="60" w:before="60"/>
-        <w:ind w:left="420"/>
-      </w:pPr>
-      <w:r>
-        <w:rPr>
-          <w:b/>
-          <w:bCs/>
-          <w:color w:val="1F3864"/>
-        </w:rPr>
-        <w:t xml:space="preserve">Your people:</w:t>
-      </w:r>
-      <w:r>
-        <w:rPr>
-          <w:color w:val="1F3864"/>
-        </w:rPr>
-        <w:t xml:space="preserve"> you already run an engagement survey. We'd measure against it, before and after.</w:t>
+        <w:t xml:space="preserve">Clinic and account growth:</w:t>
+      </w:r>
+      <w:r>
+        <w:rPr>
+          <w:color w:val="1F3864"/>
+        </w:rPr>
+        <w:t xml:space="preserve"> for SPECIFIC this comes first. Which groups and clinics you hosted, and what happened to their SPECIFIC recommendations over the next year.</w:t>
       </w:r>
     </w:p>
     <w:p>
@@ -2716,24 +2736,47 @@
         <w:rPr>
           <w:color w:val="1F3864"/>
         </w:rPr>
-        <w:t xml:space="preserve"> awareness and trust among vets, and among pet owners if we ever go there, measured before and after.</w:t>
-      </w:r>
-    </w:p>
-    <w:p>
-      <w:pPr>
-        <w:pBdr>
-          <w:left w:val="single" w:color="2E74B5" w:sz="18" w:space="12"/>
-        </w:pBdr>
-        <w:spacing w:after="60" w:before="60"/>
-        <w:ind w:left="420"/>
-      </w:pPr>
-      <w:r>
-        <w:rPr>
-          <w:b/>
-          <w:bCs/>
-          <w:color w:val="1F3864"/>
-        </w:rPr>
-        <w:t xml:space="preserve">Media and content value:</w:t>
+        <w:t xml:space="preserve"> awareness and trust among vets and vet nurses, and among owners in the markets where we'd talk to them, measured before and after.</w:t>
+      </w:r>
+    </w:p>
+    <w:p>
+      <w:pPr>
+        <w:pBdr>
+          <w:left w:val="single" w:color="2E74B5" w:sz="18" w:space="12"/>
+        </w:pBdr>
+        <w:spacing w:after="60" w:before="60"/>
+        <w:ind w:left="420"/>
+      </w:pPr>
+      <w:r>
+        <w:rPr>
+          <w:b/>
+          <w:bCs/>
+          <w:color w:val="1F3864"/>
+        </w:rPr>
+        <w:t xml:space="preserve">Content performance:</w:t>
+      </w:r>
+      <w:r>
+        <w:rPr>
+          <w:color w:val="1F3864"/>
+        </w:rPr>
+        <w:t xml:space="preserve"> reach and engagement on everything you build, especially through your Academy and clinic channels.</w:t>
+      </w:r>
+    </w:p>
+    <w:p>
+      <w:pPr>
+        <w:pBdr>
+          <w:left w:val="single" w:color="2E74B5" w:sz="18" w:space="12"/>
+        </w:pBdr>
+        <w:spacing w:after="60" w:before="60"/>
+        <w:ind w:left="420"/>
+      </w:pPr>
+      <w:r>
+        <w:rPr>
+          <w:b/>
+          <w:bCs/>
+          <w:color w:val="1F3864"/>
+        </w:rPr>
+        <w:t xml:space="preserve">Media value:</w:t>
       </w:r>
       <w:r>
         <w:rPr>
@@ -2785,7 +2828,7 @@
         <w:rPr>
           <w:color w:val="1F3864"/>
         </w:rPr>
-        <w:t xml:space="preserve">"Today, instinct only: a hospitality program first, maybe with a content piece for vets and your own people, and a bigger step only if that proves itself. I wouldn't respect you by pretending that's a recommendation.</w:t>
+        <w:t xml:space="preserve">"Today, instinct only: the clinic weekend first, maybe with the 'what goes in' content piece, and an owner-facing step only if those prove themselves and the rules allow it. I wouldn't respect you by pretending that's a recommendation.</w:t>
       </w:r>
     </w:p>
     <w:p>
@@ -2861,7 +2904,7 @@
         <w:rPr>
           <w:color w:val="1F3864"/>
         </w:rPr>
-        <w:t xml:space="preserve">For Dechra, the shapes I'd explore first live at the small end: hospitality and content. And our advice is free either way: the rights holders pay our fee."</w:t>
+        <w:t xml:space="preserve">For SPECIFIC, the shapes I'd explore first live at the small end: hospitality and content. And our advice is free either way: the rights holders pay our fee."</w:t>
       </w:r>
     </w:p>
     <w:p>
@@ -2907,7 +2950,7 @@
         <w:rPr>
           <w:color w:val="1F3864"/>
         </w:rPr>
-        <w:t xml:space="preserve">One, information. A team sells you its own story; we put all eleven next to each other: inventory, pricing, appetite, and what each would mean for Dechra specifically. For more than twelve years we worked exclusively with Mercedes and Ferrari; we gave that up deliberately to sit on the brand's side, across the whole grid. The neutral seat is the product.</w:t>
+        <w:t xml:space="preserve">One, information. A team sells you its own story; we put all eleven next to each other: inventory, pricing, appetite, and what each would mean for SPECIFIC specifically. For more than twelve years we worked exclusively with Mercedes and Ferrari; we gave that up deliberately to sit on the brand's side, across the whole grid. The neutral seat is the product.</w:t>
       </w:r>
     </w:p>
     <w:p>
@@ -2983,7 +3026,20 @@
         <w:rPr>
           <w:color w:val="1F3864"/>
         </w:rPr>
-        <w:t xml:space="preserve">Mapping animal health, pharma, pet care and pet nutrition across all eleven teams and the series is part of the analysis after this call. You'd see who's in, who's out, and where the open positions are."</w:t>
+        <w:t xml:space="preserve">Mapping pet food, pet care and animal health across all eleven teams and the series is part of the analysis after this call, including the big vet-diet names you compete with every day. You'd see who's in, who's out, and where the open positions are."</w:t>
+      </w:r>
+    </w:p>
+    <w:p>
+      <w:pPr>
+        <w:spacing w:after="80" w:before="80"/>
+      </w:pPr>
+      <w:r>
+        <w:rPr>
+          <w:i/>
+          <w:iCs/>
+          <w:color w:val="7F7F7F"/>
+        </w:rPr>
+        <w:t xml:space="preserve">[Background for you: the vet-diet competitor set to map is Hill's Prescription Diet (Colgate-Palmolive), Royal Canin Veterinary (Mars) and Purina Pro Plan Veterinary Diets (Nestle). Do not claim any of them is or isn't in F1 until it's verified.]</w:t>
       </w:r>
     </w:p>
     <w:p>
@@ -2999,52 +3055,37 @@
           <w:sz w:val="25"/>
           <w:szCs w:val="25"/>
         </w:rPr>
-        <w:t xml:space="preserve">Q8. "We're a vet pharma company. What has Formula 1 got to do with animals?"</w:t>
-      </w:r>
-    </w:p>
-    <w:p>
-      <w:pPr>
-        <w:pBdr>
-          <w:left w:val="single" w:color="2E74B5" w:sz="18" w:space="12"/>
-        </w:pBdr>
-        <w:spacing w:after="60" w:before="60"/>
-        <w:ind w:left="420"/>
-      </w:pPr>
-      <w:r>
-        <w:rPr>
-          <w:color w:val="1F3864"/>
-        </w:rPr>
-        <w:t xml:space="preserve">"On the track? Nothing. There are no animals in Formula 1, and I'd lose your trust in a minute if I tried to tell you otherwise.</w:t>
-      </w:r>
-    </w:p>
-    <w:p>
-      <w:pPr>
-        <w:pBdr>
-          <w:left w:val="single" w:color="2E74B5" w:sz="18" w:space="12"/>
-        </w:pBdr>
-        <w:spacing w:after="60" w:before="60"/>
-        <w:ind w:left="420"/>
-      </w:pPr>
-      <w:r>
-        <w:rPr>
-          <w:color w:val="1F3864"/>
-        </w:rPr>
-        <w:t xml:space="preserve">But here's the thing. You don't sell to animals. You sell to the people who look after them: vets, the groups that own practices, the distributors, and behind all of them, people who love their pets. So the real question isn't what F1 has to do with animals. It's whether it can do a job for the people in your business. Hosting the twenty people who decide your year. Giving your own team something to be proud of. Maybe telling a story about care.</w:t>
-      </w:r>
-    </w:p>
-    <w:p>
-      <w:pPr>
-        <w:pBdr>
-          <w:left w:val="single" w:color="2E74B5" w:sz="18" w:space="12"/>
-        </w:pBdr>
-        <w:spacing w:after="60" w:before="60"/>
-        <w:ind w:left="420"/>
-      </w:pPr>
-      <w:r>
-        <w:rPr>
-          <w:color w:val="1F3864"/>
-        </w:rPr>
-        <w:t xml:space="preserve">And if you'll let me have a bit of fun with it: a race car can't tell its engineers where it hurts either. They read the data, make small careful calls, and work as one team. Your customers do that every day, with patients that can't talk.</w:t>
+        <w:t xml:space="preserve">Q8. "We sell pet food through vets, not in shops. Why would 827 million fans matter to us?"</w:t>
+      </w:r>
+    </w:p>
+    <w:p>
+      <w:pPr>
+        <w:pBdr>
+          <w:left w:val="single" w:color="2E74B5" w:sz="18" w:space="12"/>
+        </w:pBdr>
+        <w:spacing w:after="60" w:before="60"/>
+        <w:ind w:left="420"/>
+      </w:pPr>
+      <w:r>
+        <w:rPr>
+          <w:color w:val="1F3864"/>
+        </w:rPr>
+        <w:t xml:space="preserve">"Fair, and it's the right question. Most of them won't matter, and if anyone pitches you reach, you should end the call.</w:t>
+      </w:r>
+    </w:p>
+    <w:p>
+      <w:pPr>
+        <w:pBdr>
+          <w:left w:val="single" w:color="2E74B5" w:sz="18" w:space="12"/>
+        </w:pBdr>
+        <w:spacing w:after="60" w:before="60"/>
+        <w:ind w:left="420"/>
+      </w:pPr>
+      <w:r>
+        <w:rPr>
+          <w:color w:val="1F3864"/>
+        </w:rPr>
+        <w:t xml:space="preserve">Here's what might. First, the people who recommend you: vet groups, clinic leaders, distributors. A race weekend is one of the best places in business to spend real time with a small number of important people. Second, a story vets already believe: the right nutrition, for a specific need. This sport lives that idea every race. And third, maybe, owners who research and stay loyal, which is how F1 fans shop and how people choose food for a pet they love. If that sends them to their vet asking about SPECIFIC, it works with your channel, not against it.</w:t>
       </w:r>
     </w:p>
     <w:p>
@@ -3128,7 +3169,7 @@
         <w:rPr>
           <w:color w:val="1F3864"/>
         </w:rPr>
-        <w:t xml:space="preserve">Step two, we map the realistic doors for Dechra: animal health and pet care across all eleven teams and the series, the hospitality and content options, and honest numbers on every one, built so you could put it in front of your owners.</w:t>
+        <w:t xml:space="preserve">Step two, we map the realistic doors for SPECIFIC: pet food and pet care across all eleven teams and the series, the hospitality and content options, and honest numbers on every one, built so you could put it in front of your owners.</w:t>
       </w:r>
     </w:p>
     <w:p>
@@ -3173,7 +3214,7 @@
         <w:rPr>
           <w:color w:val="1F3864"/>
         </w:rPr>
-        <w:t xml:space="preserve">And one more thing: the best way to judge this sport is to stand in it. Come join us at a race, bring whoever makes sense, and watch a pit crew at work. It's the closest thing to an operating team you'll see outside a hospital. We'd love to host you.</w:t>
+        <w:t xml:space="preserve">And one more thing: the best way to judge this sport is to stand in it. Come join us at a race, bring whoever makes sense, and see how much planning goes into what goes into the car. We'd love to host you.</w:t>
       </w:r>
     </w:p>
     <w:p>
@@ -3253,20 +3294,20 @@
         <w:spacing w:after="40" w:before="40"/>
       </w:pPr>
       <w:r>
-        <w:t xml:space="preserve">Write up the brief the same day: focus areas, the change story (new owners, Boston, Dechra 2030), how investments get decided and by whom, the key accounts (vet groups, distributors), markets, pet-owner appetite and the advertising rules they live by, funnel answer, budget signals, timeline, decision makers, hospitality appetite.</w:t>
-      </w:r>
-    </w:p>
-    <w:p>
-      <w:pPr>
-        <w:pStyle w:val="ListParagraph"/>
-        <w:numPr>
-          <w:ilvl w:val="0"/>
-          <w:numId w:val="1"/>
-        </w:numPr>
-        <w:spacing w:after="40" w:before="40"/>
-      </w:pPr>
-      <w:r>
-        <w:t xml:space="preserve">Score the four angles from what they said: the room, people pride, precision and care, pet owners. Drop any angle they didn't warm to.</w:t>
+        <w:t xml:space="preserve">Write up the brief the same day: where nutrition sits in Dechra's plan, how a pet ends up on SPECIFIC (vet, vet nurse, owner), markets (confirm US status), the owner question and the claim rules they live by, the key accounts (vet groups, distributors, clinics), funnel answer, whose budget this would be, how investments get decided, timeline, decision makers, hospitality appetite.</w:t>
+      </w:r>
+    </w:p>
+    <w:p>
+      <w:pPr>
+        <w:pStyle w:val="ListParagraph"/>
+        <w:numPr>
+          <w:ilvl w:val="0"/>
+          <w:numId w:val="1"/>
+        </w:numPr>
+        <w:spacing w:after="40" w:before="40"/>
+      </w:pPr>
+      <w:r>
+        <w:t xml:space="preserve">Score the four angles from what they said: the room, the "what goes in" story, pet owners, people pride. Drop any angle they didn't warm to.</w:t>
       </w:r>
     </w:p>
     <w:p>
@@ -3292,33 +3333,33 @@
         <w:spacing w:after="40" w:before="40"/>
       </w:pPr>
       <w:r>
-        <w:t xml:space="preserve">Brief the internal team: animal health, pharma, pet care and pet nutrition across the grid and series, fresh, plus any team or series limits on pharma-linked partners; hospitality-led options in Europe and the US first.</w:t>
-      </w:r>
-    </w:p>
-    <w:p>
-      <w:pPr>
-        <w:pStyle w:val="ListParagraph"/>
-        <w:numPr>
-          <w:ilvl w:val="0"/>
-          <w:numId w:val="1"/>
-        </w:numPr>
-        <w:spacing w:after="40" w:before="40"/>
-      </w:pPr>
-      <w:r>
-        <w:t xml:space="preserve">Build the payback case in their owners' language: cost per hosted key account, account growth after hosting, engagement survey movement. Smallest honest entries first, and a plain "not yet" if the numbers don't stand up.</w:t>
-      </w:r>
-    </w:p>
-    <w:p>
-      <w:pPr>
-        <w:pStyle w:val="ListParagraph"/>
-        <w:numPr>
-          <w:ilvl w:val="0"/>
-          <w:numId w:val="1"/>
-        </w:numPr>
-        <w:spacing w:after="40" w:before="40"/>
-      </w:pPr>
-      <w:r>
-        <w:t xml:space="preserve">No pet-owner idea goes on paper outside the US until their regulatory team (or ours) has confirmed what's allowed.</w:t>
+        <w:t xml:space="preserve">Brief the internal team: pet food, pet care and animal health across the grid and series, fresh, including the vet-diet competitor set; hospitality and content options in Europe first.</w:t>
+      </w:r>
+    </w:p>
+    <w:p>
+      <w:pPr>
+        <w:pStyle w:val="ListParagraph"/>
+        <w:numPr>
+          <w:ilvl w:val="0"/>
+          <w:numId w:val="1"/>
+        </w:numPr>
+        <w:spacing w:after="40" w:before="40"/>
+      </w:pPr>
+      <w:r>
+        <w:t xml:space="preserve">Build the payback case in their owners' language: cost per hosted account, change in clinic recommendations after hosting, content reach among vets and vet nurses. Smallest honest entries first, and a plain "not yet" if the numbers don't stand up.</w:t>
+      </w:r>
+    </w:p>
+    <w:p>
+      <w:pPr>
+        <w:pStyle w:val="ListParagraph"/>
+        <w:numPr>
+          <w:ilvl w:val="0"/>
+          <w:numId w:val="1"/>
+        </w:numPr>
+        <w:spacing w:after="40" w:before="40"/>
+      </w:pPr>
+      <w:r>
+        <w:t xml:space="preserve">No owner-facing idea goes on paper until their regulatory team (or ours) has confirmed the claim rules for each market, and nothing may point owners to a shop.</w:t>
       </w:r>
     </w:p>
     <w:p>

</xml_diff>